<commit_message>
Acknowledgement in required order: management, Principal Dr. S. Radha, HoD Dr. V. Rajini, guide, project coordinators
Co-Authored-By: Claude Opus 5.5 <noreply@anthropic.com>
Claude-Session: https://claude.ai/code/session_01DMwuYTdg3AZgNAfdc9qVym
</commit_message>
<xml_diff>
--- a/Final_Report.docx
+++ b/Final_Report.docx
@@ -828,7 +828,7 @@
           <w:b w:val="0"/>
           <w:i w:val="0"/>
         </w:rPr>
-        <w:t>We express our sincere gratitude to our Founder, Dr. Shiv Nadar, and to the management of Sri Sivasubramaniya Nadar College of Engineering for providing the facilities that made this project possible. We thank our Principal for the support extended to us, and Dr. V. Rajini, Professor and Head, Department of Electrical and Electronics Engineering, for her encouragement and for the facilities of the department throughout the course of this work.</w:t>
+        <w:t>We express our sincere gratitude to the management of Sri Sivasubramaniya Nadar College of Engineering for providing the facilities for this project.</w:t>
       </w:r>
     </w:p>
     <w:p>
@@ -841,7 +841,7 @@
           <w:b w:val="0"/>
           <w:i w:val="0"/>
         </w:rPr>
-        <w:t>We are deeply grateful to our guide, Dr. Rajesh Panda, Professor, Department of Electrical and Electronics Engineering, for his guidance, patience and steady encouragement at every stage of the project. His questions pushed us to quantify our claims and to be honest about what we had built and what we had modelled.</w:t>
+        <w:t>We are thankful to Dr. S. Radha, Principal, Sri Sivasubramaniya Nadar College of Engineering, for the support and encouragement extended to us throughout our course of study.</w:t>
       </w:r>
     </w:p>
     <w:p>
@@ -854,7 +854,33 @@
           <w:b w:val="0"/>
           <w:i w:val="0"/>
         </w:rPr>
-        <w:t>We thank the members of the review panel and the industry experts whose comments at the third review led us to extend this work to manufacturing. We also thank the laboratory staff of the department for their help with the hardware, and our families and friends for their constant support.</w:t>
+        <w:t>We thank Dr. V. Rajini, Professor and Head, Department of Electrical and Electronics Engineering, for her encouragement and support throughout this work.</w:t>
+      </w:r>
+    </w:p>
+    <w:p>
+      <w:pPr>
+        <w:pStyle w:val="Body"/>
+        <w:spacing w:line="480" w:lineRule="auto"/>
+      </w:pPr>
+      <w:r>
+        <w:rPr>
+          <w:b w:val="0"/>
+          <w:i w:val="0"/>
+        </w:rPr>
+        <w:t>We are deeply grateful to our project guide, Dr. Rajesh Panda, Professor, Department of Electrical and Electronics Engineering, for his guidance and encouragement at every stage of the project.</w:t>
+      </w:r>
+    </w:p>
+    <w:p>
+      <w:pPr>
+        <w:pStyle w:val="Body"/>
+        <w:spacing w:line="480" w:lineRule="auto"/>
+      </w:pPr>
+      <w:r>
+        <w:rPr>
+          <w:b w:val="0"/>
+          <w:i w:val="0"/>
+        </w:rPr>
+        <w:t>We thank the project coordinators of the department for organising the reviews and for their timely guidance. We also thank the review panel, the laboratory staff, and our families and friends for their constant support.</w:t>
       </w:r>
     </w:p>
     <w:p>

</xml_diff>

<commit_message>
Supervisor designation: Assistant Professor (bonafide, acknowledgement, deck cover)
Co-Authored-By: Claude Opus 5.5 <noreply@anthropic.com>
Claude-Session: https://claude.ai/code/session_01DMwuYTdg3AZgNAfdc9qVym
</commit_message>
<xml_diff>
--- a/Final_Report.docx
+++ b/Final_Report.docx
@@ -556,7 +556,7 @@
                 <w:b w:val="0"/>
                 <w:sz w:val="22"/>
               </w:rPr>
-              <w:t>Professor</w:t>
+              <w:t>Assistant Professor</w:t>
             </w:r>
           </w:p>
         </w:tc>
@@ -867,7 +867,7 @@
           <w:b w:val="0"/>
           <w:i w:val="0"/>
         </w:rPr>
-        <w:t>We are deeply grateful to our project guide, Dr. Rajesh Panda, Professor, Department of Electrical and Electronics Engineering, for his guidance and encouragement at every stage of the project.</w:t>
+        <w:t>We are deeply grateful to our project guide, Dr. Rajesh Panda, Assistant Professor, Department of Electrical and Electronics Engineering, for his guidance and encouragement at every stage of the project.</w:t>
       </w:r>
     </w:p>
     <w:p>

</xml_diff>

<commit_message>
Evaluator corrections (12-page scan): bold chapter labels and front headings, one-page abstract without keywords, 3.1 overview renamed Introduction, bonafide signature space and font, reference format
Co-Authored-By: Claude Opus 5.5 <noreply@anthropic.com>
Claude-Session: https://claude.ai/code/session_01DMwuYTdg3AZgNAfdc9qVym
</commit_message>
<xml_diff>
--- a/Final_Report.docx
+++ b/Final_Report.docx
@@ -401,7 +401,12 @@
         <w:t>Certified further that to the best of my knowledge the work reported herein does not form part of any other thesis or dissertation on the basis of which a degree or award was conferred on an earlier occasion on this or any other candidate.</w:t>
       </w:r>
     </w:p>
-    <w:p/>
+    <w:p>
+      <w:pPr>
+        <w:pStyle w:val="TableText"/>
+        <w:spacing w:after="320"/>
+      </w:pPr>
+    </w:p>
     <w:tbl>
       <w:tblPr>
         <w:tblW w:type="auto" w:w="0"/>
@@ -414,17 +419,18 @@
       <w:tr>
         <w:tc>
           <w:tcPr>
-            <w:tcW w:type="dxa" w:w="3827"/>
+            <w:tcW w:type="dxa" w:w="3969"/>
           </w:tcPr>
           <w:p>
             <w:pPr>
               <w:spacing w:after="0" w:line="240" w:lineRule="auto"/>
+              <w:jc w:val="left"/>
             </w:pPr>
             <w:r/>
             <w:r>
               <w:rPr>
                 <w:b/>
-                <w:sz w:val="22"/>
+                <w:sz w:val="24"/>
               </w:rPr>
               <w:t>SIGNATURE</w:t>
             </w:r>
@@ -432,17 +438,18 @@
         </w:tc>
         <w:tc>
           <w:tcPr>
-            <w:tcW w:type="dxa" w:w="3827"/>
+            <w:tcW w:type="dxa" w:w="3969"/>
           </w:tcPr>
           <w:p>
             <w:pPr>
               <w:spacing w:after="0" w:line="240" w:lineRule="auto"/>
+              <w:jc w:val="left"/>
             </w:pPr>
             <w:r/>
             <w:r>
               <w:rPr>
                 <w:b/>
-                <w:sz w:val="22"/>
+                <w:sz w:val="24"/>
               </w:rPr>
               <w:t>SIGNATURE</w:t>
             </w:r>
@@ -452,17 +459,18 @@
       <w:tr>
         <w:tc>
           <w:tcPr>
-            <w:tcW w:type="dxa" w:w="3827"/>
+            <w:tcW w:type="dxa" w:w="3969"/>
           </w:tcPr>
           <w:p>
             <w:pPr>
               <w:spacing w:after="0" w:line="240" w:lineRule="auto"/>
+              <w:jc w:val="left"/>
             </w:pPr>
             <w:r/>
             <w:r>
               <w:rPr>
                 <w:b/>
-                <w:sz w:val="22"/>
+                <w:sz w:val="24"/>
               </w:rPr>
               <w:t>Dr. V. RAJINI</w:t>
             </w:r>
@@ -470,17 +478,18 @@
         </w:tc>
         <w:tc>
           <w:tcPr>
-            <w:tcW w:type="dxa" w:w="3827"/>
+            <w:tcW w:type="dxa" w:w="3969"/>
           </w:tcPr>
           <w:p>
             <w:pPr>
               <w:spacing w:after="0" w:line="240" w:lineRule="auto"/>
+              <w:jc w:val="left"/>
             </w:pPr>
             <w:r/>
             <w:r>
               <w:rPr>
                 <w:b/>
-                <w:sz w:val="22"/>
+                <w:sz w:val="24"/>
               </w:rPr>
               <w:t>Dr. RAJESH PANDA</w:t>
             </w:r>
@@ -490,17 +499,18 @@
       <w:tr>
         <w:tc>
           <w:tcPr>
-            <w:tcW w:type="dxa" w:w="3827"/>
+            <w:tcW w:type="dxa" w:w="3969"/>
           </w:tcPr>
           <w:p>
             <w:pPr>
               <w:spacing w:after="0" w:line="240" w:lineRule="auto"/>
+              <w:jc w:val="left"/>
             </w:pPr>
             <w:r/>
             <w:r>
               <w:rPr>
                 <w:b/>
-                <w:sz w:val="22"/>
+                <w:sz w:val="24"/>
               </w:rPr>
               <w:t>HEAD OF THE DEPARTMENT</w:t>
             </w:r>
@@ -508,17 +518,18 @@
         </w:tc>
         <w:tc>
           <w:tcPr>
-            <w:tcW w:type="dxa" w:w="3827"/>
+            <w:tcW w:type="dxa" w:w="3969"/>
           </w:tcPr>
           <w:p>
             <w:pPr>
               <w:spacing w:after="0" w:line="240" w:lineRule="auto"/>
+              <w:jc w:val="left"/>
             </w:pPr>
             <w:r/>
             <w:r>
               <w:rPr>
                 <w:b/>
-                <w:sz w:val="22"/>
+                <w:sz w:val="24"/>
               </w:rPr>
               <w:t>SUPERVISOR</w:t>
             </w:r>
@@ -528,17 +539,18 @@
       <w:tr>
         <w:tc>
           <w:tcPr>
-            <w:tcW w:type="dxa" w:w="3827"/>
+            <w:tcW w:type="dxa" w:w="3969"/>
           </w:tcPr>
           <w:p>
             <w:pPr>
               <w:spacing w:after="0" w:line="240" w:lineRule="auto"/>
+              <w:jc w:val="left"/>
             </w:pPr>
             <w:r/>
             <w:r>
               <w:rPr>
                 <w:b w:val="0"/>
-                <w:sz w:val="22"/>
+                <w:sz w:val="24"/>
               </w:rPr>
               <w:t>Professor and Head</w:t>
             </w:r>
@@ -546,17 +558,18 @@
         </w:tc>
         <w:tc>
           <w:tcPr>
-            <w:tcW w:type="dxa" w:w="3827"/>
+            <w:tcW w:type="dxa" w:w="3969"/>
           </w:tcPr>
           <w:p>
             <w:pPr>
               <w:spacing w:after="0" w:line="240" w:lineRule="auto"/>
+              <w:jc w:val="left"/>
             </w:pPr>
             <w:r/>
             <w:r>
               <w:rPr>
                 <w:b w:val="0"/>
-                <w:sz w:val="22"/>
+                <w:sz w:val="24"/>
               </w:rPr>
               <w:t>Assistant Professor</w:t>
             </w:r>
@@ -566,17 +579,18 @@
       <w:tr>
         <w:tc>
           <w:tcPr>
-            <w:tcW w:type="dxa" w:w="3827"/>
+            <w:tcW w:type="dxa" w:w="3969"/>
           </w:tcPr>
           <w:p>
             <w:pPr>
               <w:spacing w:after="0" w:line="240" w:lineRule="auto"/>
+              <w:jc w:val="left"/>
             </w:pPr>
             <w:r/>
             <w:r>
               <w:rPr>
                 <w:b w:val="0"/>
-                <w:sz w:val="22"/>
+                <w:sz w:val="24"/>
               </w:rPr>
               <w:t>Department of Electrical and Electronics Engineering</w:t>
             </w:r>
@@ -584,17 +598,18 @@
         </w:tc>
         <w:tc>
           <w:tcPr>
-            <w:tcW w:type="dxa" w:w="3827"/>
+            <w:tcW w:type="dxa" w:w="3969"/>
           </w:tcPr>
           <w:p>
             <w:pPr>
               <w:spacing w:after="0" w:line="240" w:lineRule="auto"/>
+              <w:jc w:val="left"/>
             </w:pPr>
             <w:r/>
             <w:r>
               <w:rPr>
                 <w:b w:val="0"/>
-                <w:sz w:val="22"/>
+                <w:sz w:val="24"/>
               </w:rPr>
               <w:t>Department of Electrical and Electronics Engineering</w:t>
             </w:r>
@@ -604,17 +619,18 @@
       <w:tr>
         <w:tc>
           <w:tcPr>
-            <w:tcW w:type="dxa" w:w="3827"/>
+            <w:tcW w:type="dxa" w:w="3969"/>
           </w:tcPr>
           <w:p>
             <w:pPr>
               <w:spacing w:after="0" w:line="240" w:lineRule="auto"/>
+              <w:jc w:val="left"/>
             </w:pPr>
             <w:r/>
             <w:r>
               <w:rPr>
                 <w:b w:val="0"/>
-                <w:sz w:val="22"/>
+                <w:sz w:val="24"/>
               </w:rPr>
               <w:t>SSN College of Engineering</w:t>
             </w:r>
@@ -622,17 +638,18 @@
         </w:tc>
         <w:tc>
           <w:tcPr>
-            <w:tcW w:type="dxa" w:w="3827"/>
+            <w:tcW w:type="dxa" w:w="3969"/>
           </w:tcPr>
           <w:p>
             <w:pPr>
               <w:spacing w:after="0" w:line="240" w:lineRule="auto"/>
+              <w:jc w:val="left"/>
             </w:pPr>
             <w:r/>
             <w:r>
               <w:rPr>
                 <w:b w:val="0"/>
-                <w:sz w:val="22"/>
+                <w:sz w:val="24"/>
               </w:rPr>
               <w:t>SSN College of Engineering</w:t>
             </w:r>
@@ -642,17 +659,18 @@
       <w:tr>
         <w:tc>
           <w:tcPr>
-            <w:tcW w:type="dxa" w:w="3827"/>
+            <w:tcW w:type="dxa" w:w="3969"/>
           </w:tcPr>
           <w:p>
             <w:pPr>
               <w:spacing w:after="0" w:line="240" w:lineRule="auto"/>
+              <w:jc w:val="left"/>
             </w:pPr>
             <w:r/>
             <w:r>
               <w:rPr>
                 <w:b w:val="0"/>
-                <w:sz w:val="22"/>
+                <w:sz w:val="24"/>
               </w:rPr>
               <w:t>Kalavakkam - 603 110</w:t>
             </w:r>
@@ -660,17 +678,18 @@
         </w:tc>
         <w:tc>
           <w:tcPr>
-            <w:tcW w:type="dxa" w:w="3827"/>
+            <w:tcW w:type="dxa" w:w="3969"/>
           </w:tcPr>
           <w:p>
             <w:pPr>
               <w:spacing w:after="0" w:line="240" w:lineRule="auto"/>
+              <w:jc w:val="left"/>
             </w:pPr>
             <w:r/>
             <w:r>
               <w:rPr>
                 <w:b w:val="0"/>
-                <w:sz w:val="22"/>
+                <w:sz w:val="24"/>
               </w:rPr>
               <w:t>Kalavakkam - 603 110</w:t>
             </w:r>
@@ -689,54 +708,30 @@
         <w:t>Submitted for project viva-voce examination held on ...............................</w:t>
       </w:r>
     </w:p>
-    <w:tbl>
-      <w:tblPr>
-        <w:tblW w:type="auto" w:w="0"/>
-        <w:tblLook w:firstColumn="1" w:firstRow="1" w:lastColumn="0" w:lastRow="0" w:noHBand="0" w:noVBand="1" w:val="04A0"/>
-      </w:tblPr>
-      <w:tblGrid>
-        <w:gridCol w:w="3827"/>
-        <w:gridCol w:w="3827"/>
-      </w:tblGrid>
-      <w:tr>
-        <w:tc>
-          <w:tcPr>
-            <w:tcW w:type="dxa" w:w="3827"/>
-          </w:tcPr>
-          <w:p>
-            <w:pPr>
-              <w:spacing w:before="600"/>
-            </w:pPr>
-            <w:r/>
-            <w:r>
-              <w:rPr>
-                <w:b/>
-                <w:sz w:val="24"/>
-              </w:rPr>
-              <w:t>EXTERNAL EXAMINER</w:t>
-            </w:r>
-          </w:p>
-        </w:tc>
-        <w:tc>
-          <w:tcPr>
-            <w:tcW w:type="dxa" w:w="3827"/>
-          </w:tcPr>
-          <w:p>
-            <w:pPr>
-              <w:spacing w:before="600"/>
-            </w:pPr>
-            <w:r/>
-            <w:r>
-              <w:rPr>
-                <w:b/>
-                <w:sz w:val="24"/>
-              </w:rPr>
-              <w:t>INTERNAL EXAMINER</w:t>
-            </w:r>
-          </w:p>
-        </w:tc>
-      </w:tr>
-    </w:tbl>
+    <w:p>
+      <w:pPr>
+        <w:tabs>
+          <w:tab w:pos="4535" w:val="left"/>
+        </w:tabs>
+        <w:spacing w:before="360"/>
+        <w:jc w:val="left"/>
+      </w:pPr>
+      <w:r>
+        <w:rPr>
+          <w:b/>
+          <w:sz w:val="24"/>
+        </w:rPr>
+        <w:t>EXTERNAL EXAMINER</w:t>
+      </w:r>
+      <w:r>
+        <w:rPr>
+          <w:b/>
+          <w:sz w:val="24"/>
+        </w:rPr>
+        <w:tab/>
+        <w:t>INTERNAL EXAMINER</w:t>
+      </w:r>
+    </w:p>
     <w:p>
       <w:pPr>
         <w:pStyle w:val="FrontHeading"/>
@@ -744,7 +739,7 @@
       </w:pPr>
       <w:r>
         <w:rPr>
-          <w:b w:val="0"/>
+          <w:b/>
           <w:i w:val="0"/>
         </w:rPr>
         <w:t>ABSTRACT</w:t>
@@ -761,50 +756,7 @@
           <w:i w:val="0"/>
           <w:sz w:val="28"/>
         </w:rPr>
-        <w:t>Machines in small and medium machining shops keep drawing power long after they stop cutting. Pumps, fans, lights and compressors run through breaks, material waits and sometimes whole nights. This project develops an edge artificial intelligence layer that uses existing surveillance cameras to detect this waste and act on it, while keeping all video on the device.</w:t>
-      </w:r>
-    </w:p>
-    <w:p>
-      <w:pPr>
-        <w:pStyle w:val="Body"/>
-        <w:spacing w:line="480" w:lineRule="auto"/>
-      </w:pPr>
-      <w:r>
-        <w:rPr>
-          <w:b w:val="0"/>
-          <w:i w:val="0"/>
-          <w:sz w:val="28"/>
-        </w:rPr>
-        <w:t>In the first phase of the work, an edge node was built on an NVIDIA Jetson Nano running DeepStream with a TensorRT-optimised ResNet10 person detector. The node turns camera frames into a filtered person count and publishes it to a live dashboard. Following feedback from industry experts, the decision layer was then extended from an office room to a manufacturing shop. Operator presence in a region of interest at each machine is combined with machine activity from a current transformer clamp, and a four-state machine moves a machine to standby only when it is both idle and unattended, with a further deep standby for machines that are safe to power down. The same signals control zone lighting, ventilation fans, the conveyor and the compressor.</w:t>
-      </w:r>
-    </w:p>
-    <w:p>
-      <w:pPr>
-        <w:pStyle w:val="Body"/>
-        <w:spacing w:line="480" w:lineRule="auto"/>
-      </w:pPr>
-      <w:r>
-        <w:rPr>
-          <w:b w:val="0"/>
-          <w:i w:val="0"/>
-          <w:sz w:val="28"/>
-        </w:rPr>
-        <w:t>The electrical effect was evaluated with a stochastic simulation of a reference shop with ten CNC machining centres working two shifts, using the Tamil Nadu HT-I tariff of Rs 7.50 per kWh and Rs 608 per kVA per month. Over 1,000 simulated days the mean energy saving was 8.5 %, with 90 % of days between 6.6 % and 10.6 %, corresponding to 45,295 kWh, Rs 3.47 lakh and 32.2 tonnes of CO2 per year. More than half of the saving came from loads other than the machines. Maximum demand was almost unchanged, so the benefit is a reduction in energy rather than in peak demand. A timer study showed that a three-minute standby timer gives both a higher saving and fewer nuisance standbys than longer timers close to the length of a tea break. The complete installation pays back in about 3.3 months. A measurement and verification plan is proposed for validating these savings on a working shop floor.</w:t>
-      </w:r>
-    </w:p>
-    <w:p>
-      <w:pPr>
-        <w:pStyle w:val="Body"/>
-        <w:spacing w:line="480" w:lineRule="auto"/>
-        <w:ind w:firstLine="0"/>
-      </w:pPr>
-      <w:r>
-        <w:rPr>
-          <w:b w:val="0"/>
-          <w:i w:val="0"/>
-          <w:sz w:val="28"/>
-        </w:rPr>
-        <w:t>Keywords: edge AI, Jetson Nano, idle energy, machine tools, occupancy detection, MSME, energy management, demand charge</w:t>
+        <w:t>Machines in small machining shops keep drawing power long after they stop cutting, and the pumps, fans, lights and compressors around them run through breaks and material waits. This project develops an edge artificial intelligence layer that uses existing surveillance cameras to detect this waste and act on it, while keeping all video on the device. An edge node built on an NVIDIA Jetson Nano with DeepStream and a TensorRT-optimised ResNet10 detector converts camera frames into a filtered person count. Operator presence at each machine is combined with machine activity from a current transformer clamp, and a four-state machine moves a machine to standby only when it is both idle and unattended. The same signals control lighting, ventilation fans, the conveyor and the compressor. A stochastic simulation of a ten-machine, two-shift shop under the Tamil Nadu HT-I tariff gave a mean energy saving of 8.5 % over 1,000 days, equal to 45,295 kWh, Rs 3.47 lakh and 32.2 tonnes of CO2 per year, with a payback of about 3.3 months. Maximum demand was almost unchanged, so the benefit is a reduction in energy rather than in peak demand.</w:t>
       </w:r>
     </w:p>
     <w:p>
@@ -814,7 +766,7 @@
       </w:pPr>
       <w:r>
         <w:rPr>
-          <w:b w:val="0"/>
+          <w:b/>
           <w:i w:val="0"/>
         </w:rPr>
         <w:t>ACKNOWLEDGEMENT</w:t>
@@ -931,7 +883,7 @@
       </w:pPr>
       <w:r>
         <w:rPr>
-          <w:b w:val="0"/>
+          <w:b/>
           <w:i w:val="0"/>
         </w:rPr>
         <w:t>TABLE OF CONTENTS</w:t>
@@ -1124,7 +1076,7 @@
                 <w:b/>
                 <w:sz w:val="24"/>
               </w:rPr>
-              <w:t>x</w:t>
+              <w:t>ix</w:t>
             </w:r>
           </w:p>
         </w:tc>
@@ -1184,7 +1136,7 @@
                 <w:b/>
                 <w:sz w:val="24"/>
               </w:rPr>
-              <w:t>xi</w:t>
+              <w:t>x</w:t>
             </w:r>
           </w:p>
         </w:tc>
@@ -1244,7 +1196,7 @@
                 <w:b/>
                 <w:sz w:val="24"/>
               </w:rPr>
-              <w:t>xii</w:t>
+              <w:t>xi</w:t>
             </w:r>
           </w:p>
         </w:tc>
@@ -2487,7 +2439,7 @@
                 <w:b w:val="0"/>
                 <w:sz w:val="24"/>
               </w:rPr>
-              <w:t xml:space="preserve">      3.2   SYSTEM OVERVIEW</w:t>
+              <w:t xml:space="preserve">      3.2   DESIGN PRINCIPLES</w:t>
             </w:r>
           </w:p>
         </w:tc>
@@ -2507,7 +2459,7 @@
                 <w:b w:val="0"/>
                 <w:sz w:val="24"/>
               </w:rPr>
-              <w:t>15</w:t>
+              <w:t>16</w:t>
             </w:r>
           </w:p>
         </w:tc>
@@ -2547,7 +2499,7 @@
                 <w:b w:val="0"/>
                 <w:sz w:val="24"/>
               </w:rPr>
-              <w:t xml:space="preserve">      3.3   DESIGN PRINCIPLES</w:t>
+              <w:t xml:space="preserve">      3.3   SENSING INPUTS</w:t>
             </w:r>
           </w:p>
         </w:tc>
@@ -2567,7 +2519,7 @@
                 <w:b w:val="0"/>
                 <w:sz w:val="24"/>
               </w:rPr>
-              <w:t>16</w:t>
+              <w:t>17</w:t>
             </w:r>
           </w:p>
         </w:tc>
@@ -2607,7 +2559,7 @@
                 <w:b w:val="0"/>
                 <w:sz w:val="24"/>
               </w:rPr>
-              <w:t xml:space="preserve">      3.4   SENSING INPUTS</w:t>
+              <w:t xml:space="preserve">      3.4   ZONES AND REGIONS OF INTEREST</w:t>
             </w:r>
           </w:p>
         </w:tc>
@@ -2667,7 +2619,7 @@
                 <w:b w:val="0"/>
                 <w:sz w:val="24"/>
               </w:rPr>
-              <w:t xml:space="preserve">      3.5   ZONES AND REGIONS OF INTEREST</w:t>
+              <w:t xml:space="preserve">      3.5   SIGNAL CONDITIONING</w:t>
             </w:r>
           </w:p>
         </w:tc>
@@ -2687,7 +2639,7 @@
                 <w:b w:val="0"/>
                 <w:sz w:val="24"/>
               </w:rPr>
-              <w:t>17</w:t>
+              <w:t>18</w:t>
             </w:r>
           </w:p>
         </w:tc>
@@ -2727,7 +2679,7 @@
                 <w:b w:val="0"/>
                 <w:sz w:val="24"/>
               </w:rPr>
-              <w:t xml:space="preserve">      3.6   SIGNAL CONDITIONING</w:t>
+              <w:t xml:space="preserve">      3.6   MACHINE STATE MACHINE</w:t>
             </w:r>
           </w:p>
         </w:tc>
@@ -2747,7 +2699,7 @@
                 <w:b w:val="0"/>
                 <w:sz w:val="24"/>
               </w:rPr>
-              <w:t>18</w:t>
+              <w:t>19</w:t>
             </w:r>
           </w:p>
         </w:tc>
@@ -2787,7 +2739,7 @@
                 <w:b w:val="0"/>
                 <w:sz w:val="24"/>
               </w:rPr>
-              <w:t xml:space="preserve">      3.7   MACHINE STATE MACHINE</w:t>
+              <w:t xml:space="preserve">      3.7   MULTI-LOAD ACTIONS</w:t>
             </w:r>
           </w:p>
         </w:tc>
@@ -2807,7 +2759,7 @@
                 <w:b w:val="0"/>
                 <w:sz w:val="24"/>
               </w:rPr>
-              <w:t>19</w:t>
+              <w:t>21</w:t>
             </w:r>
           </w:p>
         </w:tc>
@@ -2847,7 +2799,7 @@
                 <w:b w:val="0"/>
                 <w:sz w:val="24"/>
               </w:rPr>
-              <w:t xml:space="preserve">      3.8   MULTI-LOAD ACTIONS</w:t>
+              <w:t xml:space="preserve">      3.8   ADVISORY AND AUTOMATIC MODES</w:t>
             </w:r>
           </w:p>
         </w:tc>
@@ -2907,7 +2859,7 @@
                 <w:b w:val="0"/>
                 <w:sz w:val="24"/>
               </w:rPr>
-              <w:t xml:space="preserve">      3.9   ADVISORY AND AUTOMATIC MODES</w:t>
+              <w:t xml:space="preserve">      3.9   SAFETY CONSIDERATIONS</w:t>
             </w:r>
           </w:p>
         </w:tc>
@@ -2927,7 +2879,7 @@
                 <w:b w:val="0"/>
                 <w:sz w:val="24"/>
               </w:rPr>
-              <w:t>21</w:t>
+              <w:t>22</w:t>
             </w:r>
           </w:p>
         </w:tc>
@@ -2967,7 +2919,7 @@
                 <w:b w:val="0"/>
                 <w:sz w:val="24"/>
               </w:rPr>
-              <w:t xml:space="preserve">      3.10   SAFETY CONSIDERATIONS</w:t>
+              <w:t xml:space="preserve">      3.10   PRIVACY AND WORKER ACCEPTANCE</w:t>
             </w:r>
           </w:p>
         </w:tc>
@@ -3006,6 +2958,67 @@
             <w:r/>
             <w:r>
               <w:rPr>
+                <w:b/>
+                <w:sz w:val="24"/>
+              </w:rPr>
+              <w:t>4</w:t>
+            </w:r>
+          </w:p>
+        </w:tc>
+        <w:tc>
+          <w:tcPr>
+            <w:tcW w:type="dxa" w:w="4932"/>
+          </w:tcPr>
+          <w:p>
+            <w:pPr>
+              <w:pStyle w:val="TableText"/>
+              <w:spacing w:before="0" w:after="0" w:line="360" w:lineRule="auto"/>
+            </w:pPr>
+            <w:r/>
+            <w:r>
+              <w:rPr>
+                <w:b/>
+                <w:sz w:val="24"/>
+              </w:rPr>
+              <w:t>IMPLEMENTATION OF THE EDGE NODE</w:t>
+            </w:r>
+          </w:p>
+        </w:tc>
+        <w:tc>
+          <w:tcPr>
+            <w:tcW w:type="dxa" w:w="1134"/>
+          </w:tcPr>
+          <w:p>
+            <w:pPr>
+              <w:pStyle w:val="TableText"/>
+              <w:spacing w:before="0" w:after="0" w:line="360" w:lineRule="auto"/>
+              <w:jc w:val="center"/>
+            </w:pPr>
+            <w:r/>
+            <w:r>
+              <w:rPr>
+                <w:b/>
+                <w:sz w:val="24"/>
+              </w:rPr>
+              <w:t>24</w:t>
+            </w:r>
+          </w:p>
+        </w:tc>
+      </w:tr>
+      <w:tr>
+        <w:tc>
+          <w:tcPr>
+            <w:tcW w:type="dxa" w:w="1587"/>
+          </w:tcPr>
+          <w:p>
+            <w:pPr>
+              <w:pStyle w:val="TableText"/>
+              <w:spacing w:before="0" w:after="0" w:line="360" w:lineRule="auto"/>
+              <w:jc w:val="center"/>
+            </w:pPr>
+            <w:r/>
+            <w:r>
+              <w:rPr>
                 <w:b w:val="0"/>
                 <w:sz w:val="24"/>
               </w:rPr>
@@ -3027,7 +3040,7 @@
                 <w:b w:val="0"/>
                 <w:sz w:val="24"/>
               </w:rPr>
-              <w:t xml:space="preserve">      3.11   PRIVACY AND WORKER ACCEPTANCE</w:t>
+              <w:t xml:space="preserve">      4.1   INTRODUCTION</w:t>
             </w:r>
           </w:p>
         </w:tc>
@@ -3047,7 +3060,7 @@
                 <w:b w:val="0"/>
                 <w:sz w:val="24"/>
               </w:rPr>
-              <w:t>22</w:t>
+              <w:t>24</w:t>
             </w:r>
           </w:p>
         </w:tc>
@@ -3066,10 +3079,370 @@
             <w:r/>
             <w:r>
               <w:rPr>
+                <w:b w:val="0"/>
+                <w:sz w:val="24"/>
+              </w:rPr>
+            </w:r>
+          </w:p>
+        </w:tc>
+        <w:tc>
+          <w:tcPr>
+            <w:tcW w:type="dxa" w:w="4932"/>
+          </w:tcPr>
+          <w:p>
+            <w:pPr>
+              <w:pStyle w:val="TableText"/>
+              <w:spacing w:before="0" w:after="0" w:line="360" w:lineRule="auto"/>
+            </w:pPr>
+            <w:r/>
+            <w:r>
+              <w:rPr>
+                <w:b w:val="0"/>
+                <w:sz w:val="24"/>
+              </w:rPr>
+              <w:t xml:space="preserve">      4.2   HARDWARE</w:t>
+            </w:r>
+          </w:p>
+        </w:tc>
+        <w:tc>
+          <w:tcPr>
+            <w:tcW w:type="dxa" w:w="1134"/>
+          </w:tcPr>
+          <w:p>
+            <w:pPr>
+              <w:pStyle w:val="TableText"/>
+              <w:spacing w:before="0" w:after="0" w:line="360" w:lineRule="auto"/>
+              <w:jc w:val="center"/>
+            </w:pPr>
+            <w:r/>
+            <w:r>
+              <w:rPr>
+                <w:b w:val="0"/>
+                <w:sz w:val="24"/>
+              </w:rPr>
+              <w:t>24</w:t>
+            </w:r>
+          </w:p>
+        </w:tc>
+      </w:tr>
+      <w:tr>
+        <w:tc>
+          <w:tcPr>
+            <w:tcW w:type="dxa" w:w="1587"/>
+          </w:tcPr>
+          <w:p>
+            <w:pPr>
+              <w:pStyle w:val="TableText"/>
+              <w:spacing w:before="0" w:after="0" w:line="360" w:lineRule="auto"/>
+              <w:jc w:val="center"/>
+            </w:pPr>
+            <w:r/>
+            <w:r>
+              <w:rPr>
+                <w:b w:val="0"/>
+                <w:sz w:val="24"/>
+              </w:rPr>
+            </w:r>
+          </w:p>
+        </w:tc>
+        <w:tc>
+          <w:tcPr>
+            <w:tcW w:type="dxa" w:w="4932"/>
+          </w:tcPr>
+          <w:p>
+            <w:pPr>
+              <w:pStyle w:val="TableText"/>
+              <w:spacing w:before="0" w:after="0" w:line="360" w:lineRule="auto"/>
+            </w:pPr>
+            <w:r/>
+            <w:r>
+              <w:rPr>
+                <w:b w:val="0"/>
+                <w:sz w:val="24"/>
+              </w:rPr>
+              <w:t xml:space="preserve">      4.3   SOFTWARE STACK</w:t>
+            </w:r>
+          </w:p>
+        </w:tc>
+        <w:tc>
+          <w:tcPr>
+            <w:tcW w:type="dxa" w:w="1134"/>
+          </w:tcPr>
+          <w:p>
+            <w:pPr>
+              <w:pStyle w:val="TableText"/>
+              <w:spacing w:before="0" w:after="0" w:line="360" w:lineRule="auto"/>
+              <w:jc w:val="center"/>
+            </w:pPr>
+            <w:r/>
+            <w:r>
+              <w:rPr>
+                <w:b w:val="0"/>
+                <w:sz w:val="24"/>
+              </w:rPr>
+              <w:t>26</w:t>
+            </w:r>
+          </w:p>
+        </w:tc>
+      </w:tr>
+      <w:tr>
+        <w:tc>
+          <w:tcPr>
+            <w:tcW w:type="dxa" w:w="1587"/>
+          </w:tcPr>
+          <w:p>
+            <w:pPr>
+              <w:pStyle w:val="TableText"/>
+              <w:spacing w:before="0" w:after="0" w:line="360" w:lineRule="auto"/>
+              <w:jc w:val="center"/>
+            </w:pPr>
+            <w:r/>
+            <w:r>
+              <w:rPr>
+                <w:b w:val="0"/>
+                <w:sz w:val="24"/>
+              </w:rPr>
+            </w:r>
+          </w:p>
+        </w:tc>
+        <w:tc>
+          <w:tcPr>
+            <w:tcW w:type="dxa" w:w="4932"/>
+          </w:tcPr>
+          <w:p>
+            <w:pPr>
+              <w:pStyle w:val="TableText"/>
+              <w:spacing w:before="0" w:after="0" w:line="360" w:lineRule="auto"/>
+            </w:pPr>
+            <w:r/>
+            <w:r>
+              <w:rPr>
+                <w:b w:val="0"/>
+                <w:sz w:val="24"/>
+              </w:rPr>
+              <w:t xml:space="preserve">      4.4   PIPELINE</w:t>
+            </w:r>
+          </w:p>
+        </w:tc>
+        <w:tc>
+          <w:tcPr>
+            <w:tcW w:type="dxa" w:w="1134"/>
+          </w:tcPr>
+          <w:p>
+            <w:pPr>
+              <w:pStyle w:val="TableText"/>
+              <w:spacing w:before="0" w:after="0" w:line="360" w:lineRule="auto"/>
+              <w:jc w:val="center"/>
+            </w:pPr>
+            <w:r/>
+            <w:r>
+              <w:rPr>
+                <w:b w:val="0"/>
+                <w:sz w:val="24"/>
+              </w:rPr>
+              <w:t>26</w:t>
+            </w:r>
+          </w:p>
+        </w:tc>
+      </w:tr>
+      <w:tr>
+        <w:tc>
+          <w:tcPr>
+            <w:tcW w:type="dxa" w:w="1587"/>
+          </w:tcPr>
+          <w:p>
+            <w:pPr>
+              <w:pStyle w:val="TableText"/>
+              <w:spacing w:before="0" w:after="0" w:line="360" w:lineRule="auto"/>
+              <w:jc w:val="center"/>
+            </w:pPr>
+            <w:r/>
+            <w:r>
+              <w:rPr>
+                <w:b w:val="0"/>
+                <w:sz w:val="24"/>
+              </w:rPr>
+            </w:r>
+          </w:p>
+        </w:tc>
+        <w:tc>
+          <w:tcPr>
+            <w:tcW w:type="dxa" w:w="4932"/>
+          </w:tcPr>
+          <w:p>
+            <w:pPr>
+              <w:pStyle w:val="TableText"/>
+              <w:spacing w:before="0" w:after="0" w:line="360" w:lineRule="auto"/>
+            </w:pPr>
+            <w:r/>
+            <w:r>
+              <w:rPr>
+                <w:b w:val="0"/>
+                <w:sz w:val="24"/>
+              </w:rPr>
+              <w:t xml:space="preserve">      4.5   LIVE DETECTION AND DASHBOARD</w:t>
+            </w:r>
+          </w:p>
+        </w:tc>
+        <w:tc>
+          <w:tcPr>
+            <w:tcW w:type="dxa" w:w="1134"/>
+          </w:tcPr>
+          <w:p>
+            <w:pPr>
+              <w:pStyle w:val="TableText"/>
+              <w:spacing w:before="0" w:after="0" w:line="360" w:lineRule="auto"/>
+              <w:jc w:val="center"/>
+            </w:pPr>
+            <w:r/>
+            <w:r>
+              <w:rPr>
+                <w:b w:val="0"/>
+                <w:sz w:val="24"/>
+              </w:rPr>
+              <w:t>27</w:t>
+            </w:r>
+          </w:p>
+        </w:tc>
+      </w:tr>
+      <w:tr>
+        <w:tc>
+          <w:tcPr>
+            <w:tcW w:type="dxa" w:w="1587"/>
+          </w:tcPr>
+          <w:p>
+            <w:pPr>
+              <w:pStyle w:val="TableText"/>
+              <w:spacing w:before="0" w:after="0" w:line="360" w:lineRule="auto"/>
+              <w:jc w:val="center"/>
+            </w:pPr>
+            <w:r/>
+            <w:r>
+              <w:rPr>
+                <w:b w:val="0"/>
+                <w:sz w:val="24"/>
+              </w:rPr>
+            </w:r>
+          </w:p>
+        </w:tc>
+        <w:tc>
+          <w:tcPr>
+            <w:tcW w:type="dxa" w:w="4932"/>
+          </w:tcPr>
+          <w:p>
+            <w:pPr>
+              <w:pStyle w:val="TableText"/>
+              <w:spacing w:before="0" w:after="0" w:line="360" w:lineRule="auto"/>
+            </w:pPr>
+            <w:r/>
+            <w:r>
+              <w:rPr>
+                <w:b w:val="0"/>
+                <w:sz w:val="24"/>
+              </w:rPr>
+              <w:t xml:space="preserve">      4.6   EXTENSION FOR THE SHOP FLOOR</w:t>
+            </w:r>
+          </w:p>
+        </w:tc>
+        <w:tc>
+          <w:tcPr>
+            <w:tcW w:type="dxa" w:w="1134"/>
+          </w:tcPr>
+          <w:p>
+            <w:pPr>
+              <w:pStyle w:val="TableText"/>
+              <w:spacing w:before="0" w:after="0" w:line="360" w:lineRule="auto"/>
+              <w:jc w:val="center"/>
+            </w:pPr>
+            <w:r/>
+            <w:r>
+              <w:rPr>
+                <w:b w:val="0"/>
+                <w:sz w:val="24"/>
+              </w:rPr>
+              <w:t>29</w:t>
+            </w:r>
+          </w:p>
+        </w:tc>
+      </w:tr>
+      <w:tr>
+        <w:tc>
+          <w:tcPr>
+            <w:tcW w:type="dxa" w:w="1587"/>
+          </w:tcPr>
+          <w:p>
+            <w:pPr>
+              <w:pStyle w:val="TableText"/>
+              <w:spacing w:before="0" w:after="0" w:line="360" w:lineRule="auto"/>
+              <w:jc w:val="center"/>
+            </w:pPr>
+            <w:r/>
+            <w:r>
+              <w:rPr>
+                <w:b w:val="0"/>
+                <w:sz w:val="24"/>
+              </w:rPr>
+            </w:r>
+          </w:p>
+        </w:tc>
+        <w:tc>
+          <w:tcPr>
+            <w:tcW w:type="dxa" w:w="4932"/>
+          </w:tcPr>
+          <w:p>
+            <w:pPr>
+              <w:pStyle w:val="TableText"/>
+              <w:spacing w:before="0" w:after="0" w:line="360" w:lineRule="auto"/>
+            </w:pPr>
+            <w:r/>
+            <w:r>
+              <w:rPr>
+                <w:b w:val="0"/>
+                <w:sz w:val="24"/>
+              </w:rPr>
+              <w:t xml:space="preserve">      4.7   PERFORMANCE CONSIDERATIONS</w:t>
+            </w:r>
+          </w:p>
+        </w:tc>
+        <w:tc>
+          <w:tcPr>
+            <w:tcW w:type="dxa" w:w="1134"/>
+          </w:tcPr>
+          <w:p>
+            <w:pPr>
+              <w:pStyle w:val="TableText"/>
+              <w:spacing w:before="0" w:after="0" w:line="360" w:lineRule="auto"/>
+              <w:jc w:val="center"/>
+            </w:pPr>
+            <w:r/>
+            <w:r>
+              <w:rPr>
+                <w:b w:val="0"/>
+                <w:sz w:val="24"/>
+              </w:rPr>
+              <w:t>29</w:t>
+            </w:r>
+          </w:p>
+        </w:tc>
+      </w:tr>
+      <w:tr>
+        <w:tc>
+          <w:tcPr>
+            <w:tcW w:type="dxa" w:w="1587"/>
+          </w:tcPr>
+          <w:p>
+            <w:pPr>
+              <w:pStyle w:val="TableText"/>
+              <w:spacing w:before="0" w:after="0" w:line="360" w:lineRule="auto"/>
+              <w:jc w:val="center"/>
+            </w:pPr>
+            <w:r/>
+            <w:r>
+              <w:rPr>
                 <w:b/>
                 <w:sz w:val="24"/>
               </w:rPr>
-              <w:t>4</w:t>
+              <w:t>5</w:t>
             </w:r>
           </w:p>
         </w:tc>
@@ -3088,7 +3461,7 @@
                 <w:b/>
                 <w:sz w:val="24"/>
               </w:rPr>
-              <w:t>IMPLEMENTATION OF THE EDGE NODE</w:t>
+              <w:t>ELECTRICAL ENERGY MODELLING</w:t>
             </w:r>
           </w:p>
         </w:tc>
@@ -3108,7 +3481,7 @@
                 <w:b/>
                 <w:sz w:val="24"/>
               </w:rPr>
-              <w:t>24</w:t>
+              <w:t>31</w:t>
             </w:r>
           </w:p>
         </w:tc>
@@ -3148,7 +3521,7 @@
                 <w:b w:val="0"/>
                 <w:sz w:val="24"/>
               </w:rPr>
-              <w:t xml:space="preserve">      4.1   INTRODUCTION</w:t>
+              <w:t xml:space="preserve">      5.1   INTRODUCTION</w:t>
             </w:r>
           </w:p>
         </w:tc>
@@ -3168,7 +3541,7 @@
                 <w:b w:val="0"/>
                 <w:sz w:val="24"/>
               </w:rPr>
-              <w:t>24</w:t>
+              <w:t>31</w:t>
             </w:r>
           </w:p>
         </w:tc>
@@ -3208,7 +3581,7 @@
                 <w:b w:val="0"/>
                 <w:sz w:val="24"/>
               </w:rPr>
-              <w:t xml:space="preserve">      4.2   HARDWARE</w:t>
+              <w:t xml:space="preserve">      5.2   MACHINE POWER MODEL</w:t>
             </w:r>
           </w:p>
         </w:tc>
@@ -3228,7 +3601,7 @@
                 <w:b w:val="0"/>
                 <w:sz w:val="24"/>
               </w:rPr>
-              <w:t>24</w:t>
+              <w:t>31</w:t>
             </w:r>
           </w:p>
         </w:tc>
@@ -3268,7 +3641,7 @@
                 <w:b w:val="0"/>
                 <w:sz w:val="24"/>
               </w:rPr>
-              <w:t xml:space="preserve">      4.3   SOFTWARE STACK</w:t>
+              <w:t xml:space="preserve">      5.3   SHARED LOADS</w:t>
             </w:r>
           </w:p>
         </w:tc>
@@ -3288,7 +3661,7 @@
                 <w:b w:val="0"/>
                 <w:sz w:val="24"/>
               </w:rPr>
-              <w:t>26</w:t>
+              <w:t>32</w:t>
             </w:r>
           </w:p>
         </w:tc>
@@ -3328,7 +3701,7 @@
                 <w:b w:val="0"/>
                 <w:sz w:val="24"/>
               </w:rPr>
-              <w:t xml:space="preserve">      4.4   PIPELINE</w:t>
+              <w:t xml:space="preserve">      5.4   OPERATIONS MODEL OF THE REFERENCE SHOP</w:t>
             </w:r>
           </w:p>
         </w:tc>
@@ -3348,7 +3721,7 @@
                 <w:b w:val="0"/>
                 <w:sz w:val="24"/>
               </w:rPr>
-              <w:t>26</w:t>
+              <w:t>33</w:t>
             </w:r>
           </w:p>
         </w:tc>
@@ -3388,7 +3761,7 @@
                 <w:b w:val="0"/>
                 <w:sz w:val="24"/>
               </w:rPr>
-              <w:t xml:space="preserve">      4.5   LIVE DETECTION AND DASHBOARD</w:t>
+              <w:t xml:space="preserve">      5.5   BASELINE AND CONTROLLED OPERATION</w:t>
             </w:r>
           </w:p>
         </w:tc>
@@ -3408,7 +3781,7 @@
                 <w:b w:val="0"/>
                 <w:sz w:val="24"/>
               </w:rPr>
-              <w:t>27</w:t>
+              <w:t>34</w:t>
             </w:r>
           </w:p>
         </w:tc>
@@ -3448,7 +3821,7 @@
                 <w:b w:val="0"/>
                 <w:sz w:val="24"/>
               </w:rPr>
-              <w:t xml:space="preserve">      4.6   EXTENSION FOR THE SHOP FLOOR</w:t>
+              <w:t xml:space="preserve">      5.6   ENERGY, DEMAND AND COST</w:t>
             </w:r>
           </w:p>
         </w:tc>
@@ -3468,7 +3841,7 @@
                 <w:b w:val="0"/>
                 <w:sz w:val="24"/>
               </w:rPr>
-              <w:t>29</w:t>
+              <w:t>35</w:t>
             </w:r>
           </w:p>
         </w:tc>
@@ -3508,7 +3881,7 @@
                 <w:b w:val="0"/>
                 <w:sz w:val="24"/>
               </w:rPr>
-              <w:t xml:space="preserve">      4.7   PERFORMANCE CONSIDERATIONS</w:t>
+              <w:t xml:space="preserve">      5.7   PERFORMANCE INDICATORS</w:t>
             </w:r>
           </w:p>
         </w:tc>
@@ -3528,7 +3901,7 @@
                 <w:b w:val="0"/>
                 <w:sz w:val="24"/>
               </w:rPr>
-              <w:t>29</w:t>
+              <w:t>36</w:t>
             </w:r>
           </w:p>
         </w:tc>
@@ -3547,10 +3920,70 @@
             <w:r/>
             <w:r>
               <w:rPr>
+                <w:b w:val="0"/>
+                <w:sz w:val="24"/>
+              </w:rPr>
+            </w:r>
+          </w:p>
+        </w:tc>
+        <w:tc>
+          <w:tcPr>
+            <w:tcW w:type="dxa" w:w="4932"/>
+          </w:tcPr>
+          <w:p>
+            <w:pPr>
+              <w:pStyle w:val="TableText"/>
+              <w:spacing w:before="0" w:after="0" w:line="360" w:lineRule="auto"/>
+            </w:pPr>
+            <w:r/>
+            <w:r>
+              <w:rPr>
+                <w:b w:val="0"/>
+                <w:sz w:val="24"/>
+              </w:rPr>
+              <w:t xml:space="preserve">      5.8   MODEL CHECKS</w:t>
+            </w:r>
+          </w:p>
+        </w:tc>
+        <w:tc>
+          <w:tcPr>
+            <w:tcW w:type="dxa" w:w="1134"/>
+          </w:tcPr>
+          <w:p>
+            <w:pPr>
+              <w:pStyle w:val="TableText"/>
+              <w:spacing w:before="0" w:after="0" w:line="360" w:lineRule="auto"/>
+              <w:jc w:val="center"/>
+            </w:pPr>
+            <w:r/>
+            <w:r>
+              <w:rPr>
+                <w:b w:val="0"/>
+                <w:sz w:val="24"/>
+              </w:rPr>
+              <w:t>36</w:t>
+            </w:r>
+          </w:p>
+        </w:tc>
+      </w:tr>
+      <w:tr>
+        <w:tc>
+          <w:tcPr>
+            <w:tcW w:type="dxa" w:w="1587"/>
+          </w:tcPr>
+          <w:p>
+            <w:pPr>
+              <w:pStyle w:val="TableText"/>
+              <w:spacing w:before="0" w:after="0" w:line="360" w:lineRule="auto"/>
+              <w:jc w:val="center"/>
+            </w:pPr>
+            <w:r/>
+            <w:r>
+              <w:rPr>
                 <w:b/>
                 <w:sz w:val="24"/>
               </w:rPr>
-              <w:t>5</w:t>
+              <w:t>6</w:t>
             </w:r>
           </w:p>
         </w:tc>
@@ -3569,7 +4002,7 @@
                 <w:b/>
                 <w:sz w:val="24"/>
               </w:rPr>
-              <w:t>ELECTRICAL ENERGY MODELLING</w:t>
+              <w:t>SIMULATION RESULTS AND DISCUSSION</w:t>
             </w:r>
           </w:p>
         </w:tc>
@@ -3589,7 +4022,7 @@
                 <w:b/>
                 <w:sz w:val="24"/>
               </w:rPr>
-              <w:t>31</w:t>
+              <w:t>37</w:t>
             </w:r>
           </w:p>
         </w:tc>
@@ -3629,7 +4062,7 @@
                 <w:b w:val="0"/>
                 <w:sz w:val="24"/>
               </w:rPr>
-              <w:t xml:space="preserve">      5.1   INTRODUCTION</w:t>
+              <w:t xml:space="preserve">      6.1   INTRODUCTION</w:t>
             </w:r>
           </w:p>
         </w:tc>
@@ -3649,7 +4082,7 @@
                 <w:b w:val="0"/>
                 <w:sz w:val="24"/>
               </w:rPr>
-              <w:t>31</w:t>
+              <w:t>37</w:t>
             </w:r>
           </w:p>
         </w:tc>
@@ -3689,7 +4122,7 @@
                 <w:b w:val="0"/>
                 <w:sz w:val="24"/>
               </w:rPr>
-              <w:t xml:space="preserve">      5.2   MACHINE POWER MODEL</w:t>
+              <w:t xml:space="preserve">      6.2   S1: ONE MACHINE OVER ONE SHIFT</w:t>
             </w:r>
           </w:p>
         </w:tc>
@@ -3709,7 +4142,7 @@
                 <w:b w:val="0"/>
                 <w:sz w:val="24"/>
               </w:rPr>
-              <w:t>31</w:t>
+              <w:t>37</w:t>
             </w:r>
           </w:p>
         </w:tc>
@@ -3749,7 +4182,7 @@
                 <w:b w:val="0"/>
                 <w:sz w:val="24"/>
               </w:rPr>
-              <w:t xml:space="preserve">      5.3   SHARED LOADS</w:t>
+              <w:t xml:space="preserve">      6.3   S2: WHOLE SHOP CUMULATIVE ENERGY</w:t>
             </w:r>
           </w:p>
         </w:tc>
@@ -3769,7 +4202,7 @@
                 <w:b w:val="0"/>
                 <w:sz w:val="24"/>
               </w:rPr>
-              <w:t>32</w:t>
+              <w:t>39</w:t>
             </w:r>
           </w:p>
         </w:tc>
@@ -3809,7 +4242,7 @@
                 <w:b w:val="0"/>
                 <w:sz w:val="24"/>
               </w:rPr>
-              <w:t xml:space="preserve">      5.4   OPERATIONS MODEL OF THE REFERENCE SHOP</w:t>
+              <w:t xml:space="preserve">      6.4   S3: SAVINGS BY LOAD TYPE</w:t>
             </w:r>
           </w:p>
         </w:tc>
@@ -3829,7 +4262,7 @@
                 <w:b w:val="0"/>
                 <w:sz w:val="24"/>
               </w:rPr>
-              <w:t>33</w:t>
+              <w:t>40</w:t>
             </w:r>
           </w:p>
         </w:tc>
@@ -3869,7 +4302,7 @@
                 <w:b w:val="0"/>
                 <w:sz w:val="24"/>
               </w:rPr>
-              <w:t xml:space="preserve">      5.5   BASELINE AND CONTROLLED OPERATION</w:t>
+              <w:t xml:space="preserve">      6.5   S4: LOAD-DURATION CURVE, LOAD FACTOR AND MAXIMUM DEMAND</w:t>
             </w:r>
           </w:p>
         </w:tc>
@@ -3889,7 +4322,7 @@
                 <w:b w:val="0"/>
                 <w:sz w:val="24"/>
               </w:rPr>
-              <w:t>34</w:t>
+              <w:t>41</w:t>
             </w:r>
           </w:p>
         </w:tc>
@@ -3929,7 +4362,7 @@
                 <w:b w:val="0"/>
                 <w:sz w:val="24"/>
               </w:rPr>
-              <w:t xml:space="preserve">      5.6   ENERGY, DEMAND AND COST</w:t>
+              <w:t xml:space="preserve">      6.6   S5: MONTE-CARLO ROBUSTNESS</w:t>
             </w:r>
           </w:p>
         </w:tc>
@@ -3949,7 +4382,7 @@
                 <w:b w:val="0"/>
                 <w:sz w:val="24"/>
               </w:rPr>
-              <w:t>35</w:t>
+              <w:t>42</w:t>
             </w:r>
           </w:p>
         </w:tc>
@@ -3989,7 +4422,7 @@
                 <w:b w:val="0"/>
                 <w:sz w:val="24"/>
               </w:rPr>
-              <w:t xml:space="preserve">      5.7   PERFORMANCE INDICATORS</w:t>
+              <w:t xml:space="preserve">      6.7   S6: SENSITIVITY ANALYSIS</w:t>
             </w:r>
           </w:p>
         </w:tc>
@@ -4009,7 +4442,7 @@
                 <w:b w:val="0"/>
                 <w:sz w:val="24"/>
               </w:rPr>
-              <w:t>36</w:t>
+              <w:t>44</w:t>
             </w:r>
           </w:p>
         </w:tc>
@@ -4049,7 +4482,7 @@
                 <w:b w:val="0"/>
                 <w:sz w:val="24"/>
               </w:rPr>
-              <w:t xml:space="preserve">      5.8   MODEL CHECKS</w:t>
+              <w:t xml:space="preserve">      6.8   S7: TIMER STUDY</w:t>
             </w:r>
           </w:p>
         </w:tc>
@@ -4069,7 +4502,7 @@
                 <w:b w:val="0"/>
                 <w:sz w:val="24"/>
               </w:rPr>
-              <w:t>36</w:t>
+              <w:t>45</w:t>
             </w:r>
           </w:p>
         </w:tc>
@@ -4088,10 +4521,190 @@
             <w:r/>
             <w:r>
               <w:rPr>
+                <w:b w:val="0"/>
+                <w:sz w:val="24"/>
+              </w:rPr>
+            </w:r>
+          </w:p>
+        </w:tc>
+        <w:tc>
+          <w:tcPr>
+            <w:tcW w:type="dxa" w:w="4932"/>
+          </w:tcPr>
+          <w:p>
+            <w:pPr>
+              <w:pStyle w:val="TableText"/>
+              <w:spacing w:before="0" w:after="0" w:line="360" w:lineRule="auto"/>
+            </w:pPr>
+            <w:r/>
+            <w:r>
+              <w:rPr>
+                <w:b w:val="0"/>
+                <w:sz w:val="24"/>
+              </w:rPr>
+              <w:t xml:space="preserve">      6.9   S8: PAYBACK PER NODE</w:t>
+            </w:r>
+          </w:p>
+        </w:tc>
+        <w:tc>
+          <w:tcPr>
+            <w:tcW w:type="dxa" w:w="1134"/>
+          </w:tcPr>
+          <w:p>
+            <w:pPr>
+              <w:pStyle w:val="TableText"/>
+              <w:spacing w:before="0" w:after="0" w:line="360" w:lineRule="auto"/>
+              <w:jc w:val="center"/>
+            </w:pPr>
+            <w:r/>
+            <w:r>
+              <w:rPr>
+                <w:b w:val="0"/>
+                <w:sz w:val="24"/>
+              </w:rPr>
+              <w:t>47</w:t>
+            </w:r>
+          </w:p>
+        </w:tc>
+      </w:tr>
+      <w:tr>
+        <w:tc>
+          <w:tcPr>
+            <w:tcW w:type="dxa" w:w="1587"/>
+          </w:tcPr>
+          <w:p>
+            <w:pPr>
+              <w:pStyle w:val="TableText"/>
+              <w:spacing w:before="0" w:after="0" w:line="360" w:lineRule="auto"/>
+              <w:jc w:val="center"/>
+            </w:pPr>
+            <w:r/>
+            <w:r>
+              <w:rPr>
+                <w:b w:val="0"/>
+                <w:sz w:val="24"/>
+              </w:rPr>
+            </w:r>
+          </w:p>
+        </w:tc>
+        <w:tc>
+          <w:tcPr>
+            <w:tcW w:type="dxa" w:w="4932"/>
+          </w:tcPr>
+          <w:p>
+            <w:pPr>
+              <w:pStyle w:val="TableText"/>
+              <w:spacing w:before="0" w:after="0" w:line="360" w:lineRule="auto"/>
+            </w:pPr>
+            <w:r/>
+            <w:r>
+              <w:rPr>
+                <w:b w:val="0"/>
+                <w:sz w:val="24"/>
+              </w:rPr>
+              <w:t xml:space="preserve">      6.10   S9: GENERALITY, OFFICE AND FACTORY</w:t>
+            </w:r>
+          </w:p>
+        </w:tc>
+        <w:tc>
+          <w:tcPr>
+            <w:tcW w:type="dxa" w:w="1134"/>
+          </w:tcPr>
+          <w:p>
+            <w:pPr>
+              <w:pStyle w:val="TableText"/>
+              <w:spacing w:before="0" w:after="0" w:line="360" w:lineRule="auto"/>
+              <w:jc w:val="center"/>
+            </w:pPr>
+            <w:r/>
+            <w:r>
+              <w:rPr>
+                <w:b w:val="0"/>
+                <w:sz w:val="24"/>
+              </w:rPr>
+              <w:t>48</w:t>
+            </w:r>
+          </w:p>
+        </w:tc>
+      </w:tr>
+      <w:tr>
+        <w:tc>
+          <w:tcPr>
+            <w:tcW w:type="dxa" w:w="1587"/>
+          </w:tcPr>
+          <w:p>
+            <w:pPr>
+              <w:pStyle w:val="TableText"/>
+              <w:spacing w:before="0" w:after="0" w:line="360" w:lineRule="auto"/>
+              <w:jc w:val="center"/>
+            </w:pPr>
+            <w:r/>
+            <w:r>
+              <w:rPr>
+                <w:b w:val="0"/>
+                <w:sz w:val="24"/>
+              </w:rPr>
+            </w:r>
+          </w:p>
+        </w:tc>
+        <w:tc>
+          <w:tcPr>
+            <w:tcW w:type="dxa" w:w="4932"/>
+          </w:tcPr>
+          <w:p>
+            <w:pPr>
+              <w:pStyle w:val="TableText"/>
+              <w:spacing w:before="0" w:after="0" w:line="360" w:lineRule="auto"/>
+            </w:pPr>
+            <w:r/>
+            <w:r>
+              <w:rPr>
+                <w:b w:val="0"/>
+                <w:sz w:val="24"/>
+              </w:rPr>
+              <w:t xml:space="preserve">      6.11   DISCUSSION</w:t>
+            </w:r>
+          </w:p>
+        </w:tc>
+        <w:tc>
+          <w:tcPr>
+            <w:tcW w:type="dxa" w:w="1134"/>
+          </w:tcPr>
+          <w:p>
+            <w:pPr>
+              <w:pStyle w:val="TableText"/>
+              <w:spacing w:before="0" w:after="0" w:line="360" w:lineRule="auto"/>
+              <w:jc w:val="center"/>
+            </w:pPr>
+            <w:r/>
+            <w:r>
+              <w:rPr>
+                <w:b w:val="0"/>
+                <w:sz w:val="24"/>
+              </w:rPr>
+              <w:t>49</w:t>
+            </w:r>
+          </w:p>
+        </w:tc>
+      </w:tr>
+      <w:tr>
+        <w:tc>
+          <w:tcPr>
+            <w:tcW w:type="dxa" w:w="1587"/>
+          </w:tcPr>
+          <w:p>
+            <w:pPr>
+              <w:pStyle w:val="TableText"/>
+              <w:spacing w:before="0" w:after="0" w:line="360" w:lineRule="auto"/>
+              <w:jc w:val="center"/>
+            </w:pPr>
+            <w:r/>
+            <w:r>
+              <w:rPr>
                 <w:b/>
                 <w:sz w:val="24"/>
               </w:rPr>
-              <w:t>6</w:t>
+              <w:t>7</w:t>
             </w:r>
           </w:p>
         </w:tc>
@@ -4110,7 +4723,7 @@
                 <w:b/>
                 <w:sz w:val="24"/>
               </w:rPr>
-              <w:t>SIMULATION RESULTS AND DISCUSSION</w:t>
+              <w:t>ECONOMICS, STANDARDS AND DEPLOYMENT ROADMAP</w:t>
             </w:r>
           </w:p>
         </w:tc>
@@ -4130,7 +4743,7 @@
                 <w:b/>
                 <w:sz w:val="24"/>
               </w:rPr>
-              <w:t>37</w:t>
+              <w:t>51</w:t>
             </w:r>
           </w:p>
         </w:tc>
@@ -4170,7 +4783,7 @@
                 <w:b w:val="0"/>
                 <w:sz w:val="24"/>
               </w:rPr>
-              <w:t xml:space="preserve">      6.1   INTRODUCTION</w:t>
+              <w:t xml:space="preserve">      7.1   INTRODUCTION</w:t>
             </w:r>
           </w:p>
         </w:tc>
@@ -4190,7 +4803,7 @@
                 <w:b w:val="0"/>
                 <w:sz w:val="24"/>
               </w:rPr>
-              <w:t>37</w:t>
+              <w:t>51</w:t>
             </w:r>
           </w:p>
         </w:tc>
@@ -4230,7 +4843,7 @@
                 <w:b w:val="0"/>
                 <w:sz w:val="24"/>
               </w:rPr>
-              <w:t xml:space="preserve">      6.2   S1: ONE MACHINE OVER ONE SHIFT</w:t>
+              <w:t xml:space="preserve">      7.2   COST OF A DEPLOYMENT</w:t>
             </w:r>
           </w:p>
         </w:tc>
@@ -4250,7 +4863,7 @@
                 <w:b w:val="0"/>
                 <w:sz w:val="24"/>
               </w:rPr>
-              <w:t>37</w:t>
+              <w:t>51</w:t>
             </w:r>
           </w:p>
         </w:tc>
@@ -4290,7 +4903,7 @@
                 <w:b w:val="0"/>
                 <w:sz w:val="24"/>
               </w:rPr>
-              <w:t xml:space="preserve">      6.3   S2: WHOLE SHOP CUMULATIVE ENERGY</w:t>
+              <w:t xml:space="preserve">      7.3   STANDARDS AND CONTROL PATHS</w:t>
             </w:r>
           </w:p>
         </w:tc>
@@ -4310,7 +4923,7 @@
                 <w:b w:val="0"/>
                 <w:sz w:val="24"/>
               </w:rPr>
-              <w:t>39</w:t>
+              <w:t>52</w:t>
             </w:r>
           </w:p>
         </w:tc>
@@ -4350,7 +4963,7 @@
                 <w:b w:val="0"/>
                 <w:sz w:val="24"/>
               </w:rPr>
-              <w:t xml:space="preserve">      6.4   S3: SAVINGS BY LOAD TYPE</w:t>
+              <w:t xml:space="preserve">      7.4   MEASUREMENT AND VERIFICATION PLAN</w:t>
             </w:r>
           </w:p>
         </w:tc>
@@ -4370,7 +4983,7 @@
                 <w:b w:val="0"/>
                 <w:sz w:val="24"/>
               </w:rPr>
-              <w:t>40</w:t>
+              <w:t>54</w:t>
             </w:r>
           </w:p>
         </w:tc>
@@ -4410,7 +5023,7 @@
                 <w:b w:val="0"/>
                 <w:sz w:val="24"/>
               </w:rPr>
-              <w:t xml:space="preserve">      6.5   S4: LOAD-DURATION CURVE, LOAD FACTOR AND MAXIMUM DEMAND</w:t>
+              <w:t xml:space="preserve">      7.5   DEPLOYMENT ROADMAP</w:t>
             </w:r>
           </w:p>
         </w:tc>
@@ -4430,7 +5043,7 @@
                 <w:b w:val="0"/>
                 <w:sz w:val="24"/>
               </w:rPr>
-              <w:t>41</w:t>
+              <w:t>54</w:t>
             </w:r>
           </w:p>
         </w:tc>
@@ -4470,7 +5083,7 @@
                 <w:b w:val="0"/>
                 <w:sz w:val="24"/>
               </w:rPr>
-              <w:t xml:space="preserve">      6.6   S5: MONTE-CARLO ROBUSTNESS</w:t>
+              <w:t xml:space="preserve">      7.6   BENCH DEMONSTRATION</w:t>
             </w:r>
           </w:p>
         </w:tc>
@@ -4490,7 +5103,7 @@
                 <w:b w:val="0"/>
                 <w:sz w:val="24"/>
               </w:rPr>
-              <w:t>42</w:t>
+              <w:t>55</w:t>
             </w:r>
           </w:p>
         </w:tc>
@@ -4509,6 +5122,67 @@
             <w:r/>
             <w:r>
               <w:rPr>
+                <w:b/>
+                <w:sz w:val="24"/>
+              </w:rPr>
+              <w:t>8</w:t>
+            </w:r>
+          </w:p>
+        </w:tc>
+        <w:tc>
+          <w:tcPr>
+            <w:tcW w:type="dxa" w:w="4932"/>
+          </w:tcPr>
+          <w:p>
+            <w:pPr>
+              <w:pStyle w:val="TableText"/>
+              <w:spacing w:before="0" w:after="0" w:line="360" w:lineRule="auto"/>
+            </w:pPr>
+            <w:r/>
+            <w:r>
+              <w:rPr>
+                <w:b/>
+                <w:sz w:val="24"/>
+              </w:rPr>
+              <w:t>CONCLUSION AND FUTURE WORK</w:t>
+            </w:r>
+          </w:p>
+        </w:tc>
+        <w:tc>
+          <w:tcPr>
+            <w:tcW w:type="dxa" w:w="1134"/>
+          </w:tcPr>
+          <w:p>
+            <w:pPr>
+              <w:pStyle w:val="TableText"/>
+              <w:spacing w:before="0" w:after="0" w:line="360" w:lineRule="auto"/>
+              <w:jc w:val="center"/>
+            </w:pPr>
+            <w:r/>
+            <w:r>
+              <w:rPr>
+                <w:b/>
+                <w:sz w:val="24"/>
+              </w:rPr>
+              <w:t>56</w:t>
+            </w:r>
+          </w:p>
+        </w:tc>
+      </w:tr>
+      <w:tr>
+        <w:tc>
+          <w:tcPr>
+            <w:tcW w:type="dxa" w:w="1587"/>
+          </w:tcPr>
+          <w:p>
+            <w:pPr>
+              <w:pStyle w:val="TableText"/>
+              <w:spacing w:before="0" w:after="0" w:line="360" w:lineRule="auto"/>
+              <w:jc w:val="center"/>
+            </w:pPr>
+            <w:r/>
+            <w:r>
+              <w:rPr>
                 <w:b w:val="0"/>
                 <w:sz w:val="24"/>
               </w:rPr>
@@ -4530,7 +5204,7 @@
                 <w:b w:val="0"/>
                 <w:sz w:val="24"/>
               </w:rPr>
-              <w:t xml:space="preserve">      6.7   S6: SENSITIVITY ANALYSIS</w:t>
+              <w:t xml:space="preserve">      8.1   CONCLUSIONS</w:t>
             </w:r>
           </w:p>
         </w:tc>
@@ -4550,7 +5224,7 @@
                 <w:b w:val="0"/>
                 <w:sz w:val="24"/>
               </w:rPr>
-              <w:t>44</w:t>
+              <w:t>56</w:t>
             </w:r>
           </w:p>
         </w:tc>
@@ -4590,7 +5264,7 @@
                 <w:b w:val="0"/>
                 <w:sz w:val="24"/>
               </w:rPr>
-              <w:t xml:space="preserve">      6.8   S7: TIMER STUDY</w:t>
+              <w:t xml:space="preserve">      8.2   CONTRIBUTION TO SUSTAINABLE DEVELOPMENT GOALS</w:t>
             </w:r>
           </w:p>
         </w:tc>
@@ -4610,7 +5284,7 @@
                 <w:b w:val="0"/>
                 <w:sz w:val="24"/>
               </w:rPr>
-              <w:t>45</w:t>
+              <w:t>57</w:t>
             </w:r>
           </w:p>
         </w:tc>
@@ -4650,7 +5324,7 @@
                 <w:b w:val="0"/>
                 <w:sz w:val="24"/>
               </w:rPr>
-              <w:t xml:space="preserve">      6.9   S8: PAYBACK PER NODE</w:t>
+              <w:t xml:space="preserve">      8.3   FUTURE WORK</w:t>
             </w:r>
           </w:p>
         </w:tc>
@@ -4670,7 +5344,7 @@
                 <w:b w:val="0"/>
                 <w:sz w:val="24"/>
               </w:rPr>
-              <w:t>47</w:t>
+              <w:t>58</w:t>
             </w:r>
           </w:p>
         </w:tc>
@@ -4689,7 +5363,7 @@
             <w:r/>
             <w:r>
               <w:rPr>
-                <w:b w:val="0"/>
+                <w:b/>
                 <w:sz w:val="24"/>
               </w:rPr>
             </w:r>
@@ -4707,10 +5381,10 @@
             <w:r/>
             <w:r>
               <w:rPr>
-                <w:b w:val="0"/>
+                <w:b/>
                 <w:sz w:val="24"/>
               </w:rPr>
-              <w:t xml:space="preserve">      6.10   S9: GENERALITY, OFFICE AND FACTORY</w:t>
+              <w:t>APPENDIX 1 MODEL ASSUMPTIONS</w:t>
             </w:r>
           </w:p>
         </w:tc>
@@ -4727,10 +5401,10 @@
             <w:r/>
             <w:r>
               <w:rPr>
-                <w:b w:val="0"/>
+                <w:b/>
                 <w:sz w:val="24"/>
               </w:rPr>
-              <w:t>48</w:t>
+              <w:t>59</w:t>
             </w:r>
           </w:p>
         </w:tc>
@@ -4749,7 +5423,7 @@
             <w:r/>
             <w:r>
               <w:rPr>
-                <w:b w:val="0"/>
+                <w:b/>
                 <w:sz w:val="24"/>
               </w:rPr>
             </w:r>
@@ -4767,10 +5441,10 @@
             <w:r/>
             <w:r>
               <w:rPr>
-                <w:b w:val="0"/>
+                <w:b/>
                 <w:sz w:val="24"/>
               </w:rPr>
-              <w:t xml:space="preserve">      6.11   DISCUSSION</w:t>
+              <w:t>APPENDIX 2 EDGE NODE PROBE AND FILTER</w:t>
             </w:r>
           </w:p>
         </w:tc>
@@ -4787,10 +5461,10 @@
             <w:r/>
             <w:r>
               <w:rPr>
-                <w:b w:val="0"/>
+                <w:b/>
                 <w:sz w:val="24"/>
               </w:rPr>
-              <w:t>49</w:t>
+              <w:t>61</w:t>
             </w:r>
           </w:p>
         </w:tc>
@@ -4812,7 +5486,6 @@
                 <w:b/>
                 <w:sz w:val="24"/>
               </w:rPr>
-              <w:t>7</w:t>
             </w:r>
           </w:p>
         </w:tc>
@@ -4831,7 +5504,7 @@
                 <w:b/>
                 <w:sz w:val="24"/>
               </w:rPr>
-              <w:t>ECONOMICS, STANDARDS AND DEPLOYMENT ROADMAP</w:t>
+              <w:t>APPENDIX 3 BENCH DEMONSTRATION</w:t>
             </w:r>
           </w:p>
         </w:tc>
@@ -4851,7 +5524,7 @@
                 <w:b/>
                 <w:sz w:val="24"/>
               </w:rPr>
-              <w:t>51</w:t>
+              <w:t>63</w:t>
             </w:r>
           </w:p>
         </w:tc>
@@ -4870,7 +5543,7 @@
             <w:r/>
             <w:r>
               <w:rPr>
-                <w:b w:val="0"/>
+                <w:b/>
                 <w:sz w:val="24"/>
               </w:rPr>
             </w:r>
@@ -4888,10 +5561,10 @@
             <w:r/>
             <w:r>
               <w:rPr>
-                <w:b w:val="0"/>
+                <w:b/>
                 <w:sz w:val="24"/>
               </w:rPr>
-              <w:t xml:space="preserve">      7.1   INTRODUCTION</w:t>
+              <w:t>REFERENCES</w:t>
             </w:r>
           </w:p>
         </w:tc>
@@ -4908,790 +5581,9 @@
             <w:r/>
             <w:r>
               <w:rPr>
-                <w:b w:val="0"/>
-                <w:sz w:val="24"/>
-              </w:rPr>
-              <w:t>51</w:t>
-            </w:r>
-          </w:p>
-        </w:tc>
-      </w:tr>
-      <w:tr>
-        <w:tc>
-          <w:tcPr>
-            <w:tcW w:type="dxa" w:w="1587"/>
-          </w:tcPr>
-          <w:p>
-            <w:pPr>
-              <w:pStyle w:val="TableText"/>
-              <w:spacing w:before="0" w:after="0" w:line="360" w:lineRule="auto"/>
-              <w:jc w:val="center"/>
-            </w:pPr>
-            <w:r/>
-            <w:r>
-              <w:rPr>
-                <w:b w:val="0"/>
-                <w:sz w:val="24"/>
-              </w:rPr>
-            </w:r>
-          </w:p>
-        </w:tc>
-        <w:tc>
-          <w:tcPr>
-            <w:tcW w:type="dxa" w:w="4932"/>
-          </w:tcPr>
-          <w:p>
-            <w:pPr>
-              <w:pStyle w:val="TableText"/>
-              <w:spacing w:before="0" w:after="0" w:line="360" w:lineRule="auto"/>
-            </w:pPr>
-            <w:r/>
-            <w:r>
-              <w:rPr>
-                <w:b w:val="0"/>
-                <w:sz w:val="24"/>
-              </w:rPr>
-              <w:t xml:space="preserve">      7.2   COST OF A DEPLOYMENT</w:t>
-            </w:r>
-          </w:p>
-        </w:tc>
-        <w:tc>
-          <w:tcPr>
-            <w:tcW w:type="dxa" w:w="1134"/>
-          </w:tcPr>
-          <w:p>
-            <w:pPr>
-              <w:pStyle w:val="TableText"/>
-              <w:spacing w:before="0" w:after="0" w:line="360" w:lineRule="auto"/>
-              <w:jc w:val="center"/>
-            </w:pPr>
-            <w:r/>
-            <w:r>
-              <w:rPr>
-                <w:b w:val="0"/>
-                <w:sz w:val="24"/>
-              </w:rPr>
-              <w:t>51</w:t>
-            </w:r>
-          </w:p>
-        </w:tc>
-      </w:tr>
-      <w:tr>
-        <w:tc>
-          <w:tcPr>
-            <w:tcW w:type="dxa" w:w="1587"/>
-          </w:tcPr>
-          <w:p>
-            <w:pPr>
-              <w:pStyle w:val="TableText"/>
-              <w:spacing w:before="0" w:after="0" w:line="360" w:lineRule="auto"/>
-              <w:jc w:val="center"/>
-            </w:pPr>
-            <w:r/>
-            <w:r>
-              <w:rPr>
-                <w:b w:val="0"/>
-                <w:sz w:val="24"/>
-              </w:rPr>
-            </w:r>
-          </w:p>
-        </w:tc>
-        <w:tc>
-          <w:tcPr>
-            <w:tcW w:type="dxa" w:w="4932"/>
-          </w:tcPr>
-          <w:p>
-            <w:pPr>
-              <w:pStyle w:val="TableText"/>
-              <w:spacing w:before="0" w:after="0" w:line="360" w:lineRule="auto"/>
-            </w:pPr>
-            <w:r/>
-            <w:r>
-              <w:rPr>
-                <w:b w:val="0"/>
-                <w:sz w:val="24"/>
-              </w:rPr>
-              <w:t xml:space="preserve">      7.3   STANDARDS AND CONTROL PATHS</w:t>
-            </w:r>
-          </w:p>
-        </w:tc>
-        <w:tc>
-          <w:tcPr>
-            <w:tcW w:type="dxa" w:w="1134"/>
-          </w:tcPr>
-          <w:p>
-            <w:pPr>
-              <w:pStyle w:val="TableText"/>
-              <w:spacing w:before="0" w:after="0" w:line="360" w:lineRule="auto"/>
-              <w:jc w:val="center"/>
-            </w:pPr>
-            <w:r/>
-            <w:r>
-              <w:rPr>
-                <w:b w:val="0"/>
-                <w:sz w:val="24"/>
-              </w:rPr>
-              <w:t>52</w:t>
-            </w:r>
-          </w:p>
-        </w:tc>
-      </w:tr>
-      <w:tr>
-        <w:tc>
-          <w:tcPr>
-            <w:tcW w:type="dxa" w:w="1587"/>
-          </w:tcPr>
-          <w:p>
-            <w:pPr>
-              <w:pStyle w:val="TableText"/>
-              <w:spacing w:before="0" w:after="0" w:line="360" w:lineRule="auto"/>
-              <w:jc w:val="center"/>
-            </w:pPr>
-            <w:r/>
-            <w:r>
-              <w:rPr>
-                <w:b w:val="0"/>
-                <w:sz w:val="24"/>
-              </w:rPr>
-            </w:r>
-          </w:p>
-        </w:tc>
-        <w:tc>
-          <w:tcPr>
-            <w:tcW w:type="dxa" w:w="4932"/>
-          </w:tcPr>
-          <w:p>
-            <w:pPr>
-              <w:pStyle w:val="TableText"/>
-              <w:spacing w:before="0" w:after="0" w:line="360" w:lineRule="auto"/>
-            </w:pPr>
-            <w:r/>
-            <w:r>
-              <w:rPr>
-                <w:b w:val="0"/>
-                <w:sz w:val="24"/>
-              </w:rPr>
-              <w:t xml:space="preserve">      7.4   MEASUREMENT AND VERIFICATION PLAN</w:t>
-            </w:r>
-          </w:p>
-        </w:tc>
-        <w:tc>
-          <w:tcPr>
-            <w:tcW w:type="dxa" w:w="1134"/>
-          </w:tcPr>
-          <w:p>
-            <w:pPr>
-              <w:pStyle w:val="TableText"/>
-              <w:spacing w:before="0" w:after="0" w:line="360" w:lineRule="auto"/>
-              <w:jc w:val="center"/>
-            </w:pPr>
-            <w:r/>
-            <w:r>
-              <w:rPr>
-                <w:b w:val="0"/>
-                <w:sz w:val="24"/>
-              </w:rPr>
-              <w:t>54</w:t>
-            </w:r>
-          </w:p>
-        </w:tc>
-      </w:tr>
-      <w:tr>
-        <w:tc>
-          <w:tcPr>
-            <w:tcW w:type="dxa" w:w="1587"/>
-          </w:tcPr>
-          <w:p>
-            <w:pPr>
-              <w:pStyle w:val="TableText"/>
-              <w:spacing w:before="0" w:after="0" w:line="360" w:lineRule="auto"/>
-              <w:jc w:val="center"/>
-            </w:pPr>
-            <w:r/>
-            <w:r>
-              <w:rPr>
-                <w:b w:val="0"/>
-                <w:sz w:val="24"/>
-              </w:rPr>
-            </w:r>
-          </w:p>
-        </w:tc>
-        <w:tc>
-          <w:tcPr>
-            <w:tcW w:type="dxa" w:w="4932"/>
-          </w:tcPr>
-          <w:p>
-            <w:pPr>
-              <w:pStyle w:val="TableText"/>
-              <w:spacing w:before="0" w:after="0" w:line="360" w:lineRule="auto"/>
-            </w:pPr>
-            <w:r/>
-            <w:r>
-              <w:rPr>
-                <w:b w:val="0"/>
-                <w:sz w:val="24"/>
-              </w:rPr>
-              <w:t xml:space="preserve">      7.5   DEPLOYMENT ROADMAP</w:t>
-            </w:r>
-          </w:p>
-        </w:tc>
-        <w:tc>
-          <w:tcPr>
-            <w:tcW w:type="dxa" w:w="1134"/>
-          </w:tcPr>
-          <w:p>
-            <w:pPr>
-              <w:pStyle w:val="TableText"/>
-              <w:spacing w:before="0" w:after="0" w:line="360" w:lineRule="auto"/>
-              <w:jc w:val="center"/>
-            </w:pPr>
-            <w:r/>
-            <w:r>
-              <w:rPr>
-                <w:b w:val="0"/>
-                <w:sz w:val="24"/>
-              </w:rPr>
-              <w:t>54</w:t>
-            </w:r>
-          </w:p>
-        </w:tc>
-      </w:tr>
-      <w:tr>
-        <w:tc>
-          <w:tcPr>
-            <w:tcW w:type="dxa" w:w="1587"/>
-          </w:tcPr>
-          <w:p>
-            <w:pPr>
-              <w:pStyle w:val="TableText"/>
-              <w:spacing w:before="0" w:after="0" w:line="360" w:lineRule="auto"/>
-              <w:jc w:val="center"/>
-            </w:pPr>
-            <w:r/>
-            <w:r>
-              <w:rPr>
-                <w:b w:val="0"/>
-                <w:sz w:val="24"/>
-              </w:rPr>
-            </w:r>
-          </w:p>
-        </w:tc>
-        <w:tc>
-          <w:tcPr>
-            <w:tcW w:type="dxa" w:w="4932"/>
-          </w:tcPr>
-          <w:p>
-            <w:pPr>
-              <w:pStyle w:val="TableText"/>
-              <w:spacing w:before="0" w:after="0" w:line="360" w:lineRule="auto"/>
-            </w:pPr>
-            <w:r/>
-            <w:r>
-              <w:rPr>
-                <w:b w:val="0"/>
-                <w:sz w:val="24"/>
-              </w:rPr>
-              <w:t xml:space="preserve">      7.6   BENCH DEMONSTRATION</w:t>
-            </w:r>
-          </w:p>
-        </w:tc>
-        <w:tc>
-          <w:tcPr>
-            <w:tcW w:type="dxa" w:w="1134"/>
-          </w:tcPr>
-          <w:p>
-            <w:pPr>
-              <w:pStyle w:val="TableText"/>
-              <w:spacing w:before="0" w:after="0" w:line="360" w:lineRule="auto"/>
-              <w:jc w:val="center"/>
-            </w:pPr>
-            <w:r/>
-            <w:r>
-              <w:rPr>
-                <w:b w:val="0"/>
-                <w:sz w:val="24"/>
-              </w:rPr>
-              <w:t>55</w:t>
-            </w:r>
-          </w:p>
-        </w:tc>
-      </w:tr>
-      <w:tr>
-        <w:tc>
-          <w:tcPr>
-            <w:tcW w:type="dxa" w:w="1587"/>
-          </w:tcPr>
-          <w:p>
-            <w:pPr>
-              <w:pStyle w:val="TableText"/>
-              <w:spacing w:before="0" w:after="0" w:line="360" w:lineRule="auto"/>
-              <w:jc w:val="center"/>
-            </w:pPr>
-            <w:r/>
-            <w:r>
-              <w:rPr>
                 <w:b/>
                 <w:sz w:val="24"/>
               </w:rPr>
-              <w:t>8</w:t>
-            </w:r>
-          </w:p>
-        </w:tc>
-        <w:tc>
-          <w:tcPr>
-            <w:tcW w:type="dxa" w:w="4932"/>
-          </w:tcPr>
-          <w:p>
-            <w:pPr>
-              <w:pStyle w:val="TableText"/>
-              <w:spacing w:before="0" w:after="0" w:line="360" w:lineRule="auto"/>
-            </w:pPr>
-            <w:r/>
-            <w:r>
-              <w:rPr>
-                <w:b/>
-                <w:sz w:val="24"/>
-              </w:rPr>
-              <w:t>CONCLUSION AND FUTURE WORK</w:t>
-            </w:r>
-          </w:p>
-        </w:tc>
-        <w:tc>
-          <w:tcPr>
-            <w:tcW w:type="dxa" w:w="1134"/>
-          </w:tcPr>
-          <w:p>
-            <w:pPr>
-              <w:pStyle w:val="TableText"/>
-              <w:spacing w:before="0" w:after="0" w:line="360" w:lineRule="auto"/>
-              <w:jc w:val="center"/>
-            </w:pPr>
-            <w:r/>
-            <w:r>
-              <w:rPr>
-                <w:b/>
-                <w:sz w:val="24"/>
-              </w:rPr>
-              <w:t>56</w:t>
-            </w:r>
-          </w:p>
-        </w:tc>
-      </w:tr>
-      <w:tr>
-        <w:tc>
-          <w:tcPr>
-            <w:tcW w:type="dxa" w:w="1587"/>
-          </w:tcPr>
-          <w:p>
-            <w:pPr>
-              <w:pStyle w:val="TableText"/>
-              <w:spacing w:before="0" w:after="0" w:line="360" w:lineRule="auto"/>
-              <w:jc w:val="center"/>
-            </w:pPr>
-            <w:r/>
-            <w:r>
-              <w:rPr>
-                <w:b w:val="0"/>
-                <w:sz w:val="24"/>
-              </w:rPr>
-            </w:r>
-          </w:p>
-        </w:tc>
-        <w:tc>
-          <w:tcPr>
-            <w:tcW w:type="dxa" w:w="4932"/>
-          </w:tcPr>
-          <w:p>
-            <w:pPr>
-              <w:pStyle w:val="TableText"/>
-              <w:spacing w:before="0" w:after="0" w:line="360" w:lineRule="auto"/>
-            </w:pPr>
-            <w:r/>
-            <w:r>
-              <w:rPr>
-                <w:b w:val="0"/>
-                <w:sz w:val="24"/>
-              </w:rPr>
-              <w:t xml:space="preserve">      8.1   CONCLUSIONS</w:t>
-            </w:r>
-          </w:p>
-        </w:tc>
-        <w:tc>
-          <w:tcPr>
-            <w:tcW w:type="dxa" w:w="1134"/>
-          </w:tcPr>
-          <w:p>
-            <w:pPr>
-              <w:pStyle w:val="TableText"/>
-              <w:spacing w:before="0" w:after="0" w:line="360" w:lineRule="auto"/>
-              <w:jc w:val="center"/>
-            </w:pPr>
-            <w:r/>
-            <w:r>
-              <w:rPr>
-                <w:b w:val="0"/>
-                <w:sz w:val="24"/>
-              </w:rPr>
-              <w:t>56</w:t>
-            </w:r>
-          </w:p>
-        </w:tc>
-      </w:tr>
-      <w:tr>
-        <w:tc>
-          <w:tcPr>
-            <w:tcW w:type="dxa" w:w="1587"/>
-          </w:tcPr>
-          <w:p>
-            <w:pPr>
-              <w:pStyle w:val="TableText"/>
-              <w:spacing w:before="0" w:after="0" w:line="360" w:lineRule="auto"/>
-              <w:jc w:val="center"/>
-            </w:pPr>
-            <w:r/>
-            <w:r>
-              <w:rPr>
-                <w:b w:val="0"/>
-                <w:sz w:val="24"/>
-              </w:rPr>
-            </w:r>
-          </w:p>
-        </w:tc>
-        <w:tc>
-          <w:tcPr>
-            <w:tcW w:type="dxa" w:w="4932"/>
-          </w:tcPr>
-          <w:p>
-            <w:pPr>
-              <w:pStyle w:val="TableText"/>
-              <w:spacing w:before="0" w:after="0" w:line="360" w:lineRule="auto"/>
-            </w:pPr>
-            <w:r/>
-            <w:r>
-              <w:rPr>
-                <w:b w:val="0"/>
-                <w:sz w:val="24"/>
-              </w:rPr>
-              <w:t xml:space="preserve">      8.2   CONTRIBUTION TO SUSTAINABLE DEVELOPMENT GOALS</w:t>
-            </w:r>
-          </w:p>
-        </w:tc>
-        <w:tc>
-          <w:tcPr>
-            <w:tcW w:type="dxa" w:w="1134"/>
-          </w:tcPr>
-          <w:p>
-            <w:pPr>
-              <w:pStyle w:val="TableText"/>
-              <w:spacing w:before="0" w:after="0" w:line="360" w:lineRule="auto"/>
-              <w:jc w:val="center"/>
-            </w:pPr>
-            <w:r/>
-            <w:r>
-              <w:rPr>
-                <w:b w:val="0"/>
-                <w:sz w:val="24"/>
-              </w:rPr>
-              <w:t>57</w:t>
-            </w:r>
-          </w:p>
-        </w:tc>
-      </w:tr>
-      <w:tr>
-        <w:tc>
-          <w:tcPr>
-            <w:tcW w:type="dxa" w:w="1587"/>
-          </w:tcPr>
-          <w:p>
-            <w:pPr>
-              <w:pStyle w:val="TableText"/>
-              <w:spacing w:before="0" w:after="0" w:line="360" w:lineRule="auto"/>
-              <w:jc w:val="center"/>
-            </w:pPr>
-            <w:r/>
-            <w:r>
-              <w:rPr>
-                <w:b w:val="0"/>
-                <w:sz w:val="24"/>
-              </w:rPr>
-            </w:r>
-          </w:p>
-        </w:tc>
-        <w:tc>
-          <w:tcPr>
-            <w:tcW w:type="dxa" w:w="4932"/>
-          </w:tcPr>
-          <w:p>
-            <w:pPr>
-              <w:pStyle w:val="TableText"/>
-              <w:spacing w:before="0" w:after="0" w:line="360" w:lineRule="auto"/>
-            </w:pPr>
-            <w:r/>
-            <w:r>
-              <w:rPr>
-                <w:b w:val="0"/>
-                <w:sz w:val="24"/>
-              </w:rPr>
-              <w:t xml:space="preserve">      8.3   FUTURE WORK</w:t>
-            </w:r>
-          </w:p>
-        </w:tc>
-        <w:tc>
-          <w:tcPr>
-            <w:tcW w:type="dxa" w:w="1134"/>
-          </w:tcPr>
-          <w:p>
-            <w:pPr>
-              <w:pStyle w:val="TableText"/>
-              <w:spacing w:before="0" w:after="0" w:line="360" w:lineRule="auto"/>
-              <w:jc w:val="center"/>
-            </w:pPr>
-            <w:r/>
-            <w:r>
-              <w:rPr>
-                <w:b w:val="0"/>
-                <w:sz w:val="24"/>
-              </w:rPr>
-              <w:t>58</w:t>
-            </w:r>
-          </w:p>
-        </w:tc>
-      </w:tr>
-      <w:tr>
-        <w:tc>
-          <w:tcPr>
-            <w:tcW w:type="dxa" w:w="1587"/>
-          </w:tcPr>
-          <w:p>
-            <w:pPr>
-              <w:pStyle w:val="TableText"/>
-              <w:spacing w:before="0" w:after="0" w:line="360" w:lineRule="auto"/>
-              <w:jc w:val="center"/>
-            </w:pPr>
-            <w:r/>
-            <w:r>
-              <w:rPr>
-                <w:b/>
-                <w:sz w:val="24"/>
-              </w:rPr>
-            </w:r>
-          </w:p>
-        </w:tc>
-        <w:tc>
-          <w:tcPr>
-            <w:tcW w:type="dxa" w:w="4932"/>
-          </w:tcPr>
-          <w:p>
-            <w:pPr>
-              <w:pStyle w:val="TableText"/>
-              <w:spacing w:before="0" w:after="0" w:line="360" w:lineRule="auto"/>
-            </w:pPr>
-            <w:r/>
-            <w:r>
-              <w:rPr>
-                <w:b/>
-                <w:sz w:val="24"/>
-              </w:rPr>
-              <w:t>APPENDIX 1 MODEL ASSUMPTIONS</w:t>
-            </w:r>
-          </w:p>
-        </w:tc>
-        <w:tc>
-          <w:tcPr>
-            <w:tcW w:type="dxa" w:w="1134"/>
-          </w:tcPr>
-          <w:p>
-            <w:pPr>
-              <w:pStyle w:val="TableText"/>
-              <w:spacing w:before="0" w:after="0" w:line="360" w:lineRule="auto"/>
-              <w:jc w:val="center"/>
-            </w:pPr>
-            <w:r/>
-            <w:r>
-              <w:rPr>
-                <w:b/>
-                <w:sz w:val="24"/>
-              </w:rPr>
-              <w:t>59</w:t>
-            </w:r>
-          </w:p>
-        </w:tc>
-      </w:tr>
-      <w:tr>
-        <w:tc>
-          <w:tcPr>
-            <w:tcW w:type="dxa" w:w="1587"/>
-          </w:tcPr>
-          <w:p>
-            <w:pPr>
-              <w:pStyle w:val="TableText"/>
-              <w:spacing w:before="0" w:after="0" w:line="360" w:lineRule="auto"/>
-              <w:jc w:val="center"/>
-            </w:pPr>
-            <w:r/>
-            <w:r>
-              <w:rPr>
-                <w:b/>
-                <w:sz w:val="24"/>
-              </w:rPr>
-            </w:r>
-          </w:p>
-        </w:tc>
-        <w:tc>
-          <w:tcPr>
-            <w:tcW w:type="dxa" w:w="4932"/>
-          </w:tcPr>
-          <w:p>
-            <w:pPr>
-              <w:pStyle w:val="TableText"/>
-              <w:spacing w:before="0" w:after="0" w:line="360" w:lineRule="auto"/>
-            </w:pPr>
-            <w:r/>
-            <w:r>
-              <w:rPr>
-                <w:b/>
-                <w:sz w:val="24"/>
-              </w:rPr>
-              <w:t>APPENDIX 2 EDGE NODE PROBE AND FILTER</w:t>
-            </w:r>
-          </w:p>
-        </w:tc>
-        <w:tc>
-          <w:tcPr>
-            <w:tcW w:type="dxa" w:w="1134"/>
-          </w:tcPr>
-          <w:p>
-            <w:pPr>
-              <w:pStyle w:val="TableText"/>
-              <w:spacing w:before="0" w:after="0" w:line="360" w:lineRule="auto"/>
-              <w:jc w:val="center"/>
-            </w:pPr>
-            <w:r/>
-            <w:r>
-              <w:rPr>
-                <w:b/>
-                <w:sz w:val="24"/>
-              </w:rPr>
-              <w:t>61</w:t>
-            </w:r>
-          </w:p>
-        </w:tc>
-      </w:tr>
-      <w:tr>
-        <w:tc>
-          <w:tcPr>
-            <w:tcW w:type="dxa" w:w="1587"/>
-          </w:tcPr>
-          <w:p>
-            <w:pPr>
-              <w:pStyle w:val="TableText"/>
-              <w:spacing w:before="0" w:after="0" w:line="360" w:lineRule="auto"/>
-              <w:jc w:val="center"/>
-            </w:pPr>
-            <w:r/>
-            <w:r>
-              <w:rPr>
-                <w:b/>
-                <w:sz w:val="24"/>
-              </w:rPr>
-            </w:r>
-          </w:p>
-        </w:tc>
-        <w:tc>
-          <w:tcPr>
-            <w:tcW w:type="dxa" w:w="4932"/>
-          </w:tcPr>
-          <w:p>
-            <w:pPr>
-              <w:pStyle w:val="TableText"/>
-              <w:spacing w:before="0" w:after="0" w:line="360" w:lineRule="auto"/>
-            </w:pPr>
-            <w:r/>
-            <w:r>
-              <w:rPr>
-                <w:b/>
-                <w:sz w:val="24"/>
-              </w:rPr>
-              <w:t>APPENDIX 3 BENCH DEMONSTRATION</w:t>
-            </w:r>
-          </w:p>
-        </w:tc>
-        <w:tc>
-          <w:tcPr>
-            <w:tcW w:type="dxa" w:w="1134"/>
-          </w:tcPr>
-          <w:p>
-            <w:pPr>
-              <w:pStyle w:val="TableText"/>
-              <w:spacing w:before="0" w:after="0" w:line="360" w:lineRule="auto"/>
-              <w:jc w:val="center"/>
-            </w:pPr>
-            <w:r/>
-            <w:r>
-              <w:rPr>
-                <w:b/>
-                <w:sz w:val="24"/>
-              </w:rPr>
-              <w:t>63</w:t>
-            </w:r>
-          </w:p>
-        </w:tc>
-      </w:tr>
-      <w:tr>
-        <w:tc>
-          <w:tcPr>
-            <w:tcW w:type="dxa" w:w="1587"/>
-          </w:tcPr>
-          <w:p>
-            <w:pPr>
-              <w:pStyle w:val="TableText"/>
-              <w:spacing w:before="0" w:after="0" w:line="360" w:lineRule="auto"/>
-              <w:jc w:val="center"/>
-            </w:pPr>
-            <w:r/>
-            <w:r>
-              <w:rPr>
-                <w:b/>
-                <w:sz w:val="24"/>
-              </w:rPr>
-            </w:r>
-          </w:p>
-        </w:tc>
-        <w:tc>
-          <w:tcPr>
-            <w:tcW w:type="dxa" w:w="4932"/>
-          </w:tcPr>
-          <w:p>
-            <w:pPr>
-              <w:pStyle w:val="TableText"/>
-              <w:spacing w:before="0" w:after="0" w:line="360" w:lineRule="auto"/>
-            </w:pPr>
-            <w:r/>
-            <w:r>
-              <w:rPr>
-                <w:b/>
-                <w:sz w:val="24"/>
-              </w:rPr>
-              <w:t>REFERENCES</w:t>
-            </w:r>
-          </w:p>
-        </w:tc>
-        <w:tc>
-          <w:tcPr>
-            <w:tcW w:type="dxa" w:w="1134"/>
-          </w:tcPr>
-          <w:p>
-            <w:pPr>
-              <w:pStyle w:val="TableText"/>
-              <w:spacing w:before="0" w:after="0" w:line="360" w:lineRule="auto"/>
-              <w:jc w:val="center"/>
-            </w:pPr>
-            <w:r/>
-            <w:r>
-              <w:rPr>
-                <w:b/>
-                <w:sz w:val="24"/>
-              </w:rPr>
               <w:t>64</w:t>
             </w:r>
           </w:p>
@@ -5705,7 +5597,7 @@
       </w:pPr>
       <w:r>
         <w:rPr>
-          <w:b w:val="0"/>
+          <w:b/>
           <w:i w:val="0"/>
         </w:rPr>
         <w:t>LIST OF TABLES</w:t>
@@ -7011,7 +6903,7 @@
       </w:pPr>
       <w:r>
         <w:rPr>
-          <w:b w:val="0"/>
+          <w:b/>
           <w:i w:val="0"/>
         </w:rPr>
         <w:t>LIST OF FIGURES</w:t>
@@ -8012,7 +7904,7 @@
       </w:pPr>
       <w:r>
         <w:rPr>
-          <w:b w:val="0"/>
+          <w:b/>
           <w:i w:val="0"/>
         </w:rPr>
         <w:t>LIST OF SYMBOLS AND ABBREVIATIONS</w:t>
@@ -9501,7 +9393,7 @@
       </w:pPr>
       <w:r>
         <w:rPr>
-          <w:b w:val="0"/>
+          <w:b/>
           <w:i w:val="0"/>
         </w:rPr>
         <w:t>CHAPTER 1</w:t>
@@ -10598,7 +10490,7 @@
       </w:pPr>
       <w:r>
         <w:rPr>
-          <w:b w:val="0"/>
+          <w:b/>
           <w:i w:val="0"/>
         </w:rPr>
         <w:t>CHAPTER 2</w:t>
@@ -11476,7 +11368,7 @@
       </w:pPr>
       <w:r>
         <w:rPr>
-          <w:b w:val="0"/>
+          <w:b/>
           <w:i w:val="0"/>
         </w:rPr>
         <w:t>CHAPTER 3</w:t>
@@ -11514,19 +11406,6 @@
           <w:i w:val="0"/>
         </w:rPr>
         <w:t>This chapter describes how the edge node and its decision logic fit together. It begins with an overview of the three layers of the system and the principles that guided the design. It then explains the sensing inputs, the zones and regions of interest on the shop floor, and the filtering applied to the raw signals. The machine state machine and the rules for the shared loads follow, together with the advisory and automatic operating modes. The chapter closes with the safety and privacy measures that a factory deployment needs.</w:t>
-      </w:r>
-    </w:p>
-    <w:p>
-      <w:pPr>
-        <w:pStyle w:val="Heading2"/>
-        <w:tabs>
-          <w:tab w:pos="1134" w:val="left"/>
-        </w:tabs>
-      </w:pPr>
-      <w:r>
-        <w:t>3.2</w:t>
-        <w:tab/>
-        <w:t>SYSTEM OVERVIEW</w:t>
       </w:r>
     </w:p>
     <w:p>
@@ -11614,7 +11493,7 @@
         </w:tabs>
       </w:pPr>
       <w:r>
-        <w:t>3.3</w:t>
+        <w:t>3.2</w:t>
         <w:tab/>
         <w:t>DESIGN PRINCIPLES</w:t>
       </w:r>
@@ -11707,7 +11586,7 @@
         </w:tabs>
       </w:pPr>
       <w:r>
-        <w:t>3.4</w:t>
+        <w:t>3.3</w:t>
         <w:tab/>
         <w:t>SENSING INPUTS</w:t>
       </w:r>
@@ -12048,7 +11927,7 @@
         </w:tabs>
       </w:pPr>
       <w:r>
-        <w:t>3.5</w:t>
+        <w:t>3.4</w:t>
         <w:tab/>
         <w:t>ZONES AND REGIONS OF INTEREST</w:t>
       </w:r>
@@ -12138,7 +12017,7 @@
         </w:tabs>
       </w:pPr>
       <w:r>
-        <w:t>3.6</w:t>
+        <w:t>3.5</w:t>
         <w:tab/>
         <w:t>SIGNAL CONDITIONING</w:t>
       </w:r>
@@ -12205,7 +12084,7 @@
         </w:tabs>
       </w:pPr>
       <w:r>
-        <w:t>3.7</w:t>
+        <w:t>3.6</w:t>
         <w:tab/>
         <w:t>MACHINE STATE MACHINE</w:t>
       </w:r>
@@ -12676,7 +12555,7 @@
         </w:tabs>
       </w:pPr>
       <w:r>
-        <w:t>3.8</w:t>
+        <w:t>3.7</w:t>
         <w:tab/>
         <w:t>MULTI-LOAD ACTIONS</w:t>
       </w:r>
@@ -13082,7 +12961,7 @@
         </w:tabs>
       </w:pPr>
       <w:r>
-        <w:t>3.9</w:t>
+        <w:t>3.8</w:t>
         <w:tab/>
         <w:t>ADVISORY AND AUTOMATIC MODES</w:t>
       </w:r>
@@ -13119,7 +12998,7 @@
         </w:tabs>
       </w:pPr>
       <w:r>
-        <w:t>3.10</w:t>
+        <w:t>3.9</w:t>
         <w:tab/>
         <w:t>SAFETY CONSIDERATIONS</w:t>
       </w:r>
@@ -13144,7 +13023,7 @@
         </w:tabs>
       </w:pPr>
       <w:r>
-        <w:t>3.11</w:t>
+        <w:t>3.10</w:t>
         <w:tab/>
         <w:t>PRIVACY AND WORKER ACCEPTANCE</w:t>
       </w:r>
@@ -13168,7 +13047,7 @@
       </w:pPr>
       <w:r>
         <w:rPr>
-          <w:b w:val="0"/>
+          <w:b/>
           <w:i w:val="0"/>
         </w:rPr>
         <w:t>CHAPTER 4</w:t>
@@ -14207,7 +14086,7 @@
           <w:b w:val="0"/>
           <w:i w:val="0"/>
         </w:rPr>
-        <w:t>The probe function walks through the object metadata of each frame and counts the objects of the person class whose confidence exceeds the threshold set in the nvinfer configuration file. The raw count is passed to the temporal filter described in Section 3.6. Once a second, the filtered count, the resulting state and the modelled power are written to a small JSON file, live_state.json, which is read by the dashboard. The core of the probe function and the filter is listed in Appendix 2.</w:t>
+        <w:t>The probe function walks through the object metadata of each frame and counts the objects of the person class whose confidence exceeds the threshold set in the nvinfer configuration file. The raw count is passed to the temporal filter described in Section 3.5. Once a second, the filtered count, the resulting state and the modelled power are written to a small JSON file, live_state.json, which is read by the dashboard. The core of the probe function and the filter is listed in Appendix 2.</w:t>
       </w:r>
     </w:p>
     <w:p>
@@ -14470,7 +14349,7 @@
       </w:pPr>
       <w:r>
         <w:rPr>
-          <w:b w:val="0"/>
+          <w:b/>
           <w:i w:val="0"/>
         </w:rPr>
         <w:t>CHAPTER 5</w:t>
@@ -16444,7 +16323,7 @@
       </w:pPr>
       <w:r>
         <w:rPr>
-          <w:b w:val="0"/>
+          <w:b/>
           <w:i w:val="0"/>
         </w:rPr>
         <w:t>CHAPTER 6</w:t>
@@ -19518,7 +19397,7 @@
       </w:pPr>
       <w:r>
         <w:rPr>
-          <w:b w:val="0"/>
+          <w:b/>
           <w:i w:val="0"/>
         </w:rPr>
         <w:t>CHAPTER 7</w:t>
@@ -21019,7 +20898,7 @@
       </w:pPr>
       <w:r>
         <w:rPr>
-          <w:b w:val="0"/>
+          <w:b/>
           <w:i w:val="0"/>
         </w:rPr>
         <w:t>CHAPTER 8</w:t>
@@ -22697,7 +22576,7 @@
           <w:b w:val="0"/>
           <w:i w:val="0"/>
         </w:rPr>
-        <w:t>The listing below shows the PyDS probe function attached to the DeepStream pipeline, the per-region counting and the asymmetric presence filter of Section 3.6.</w:t>
+        <w:t>The listing below shows the PyDS probe function attached to the DeepStream pipeline, the per-region counting and the asymmetric presence filter of Section 3.5.</w:t>
       </w:r>
     </w:p>
     <w:p>
@@ -22762,7 +22641,7 @@
           <w:b w:val="0"/>
           <w:i w:val="0"/>
         </w:rPr>
-        <w:t>RISE_S, FALL_S = 10, 60      # asymmetric persistence filter (Section 3.6)</w:t>
+        <w:t>RISE_S, FALL_S = 10, 60      # asymmetric persistence filter (Section 3.5)</w:t>
       </w:r>
     </w:p>
     <w:p>
@@ -24011,7 +23890,7 @@
         </w:rPr>
         <w:t>3.</w:t>
         <w:tab/>
-        <w:t>Choi H., Lee J., Yi Y., Na H., Kang K. and Kim T. (2022), 'Deep vision-based occupancy counting: experimental performance evaluation and implementation of ventilation control', Building and Environment, Vol. 223, 109496.</w:t>
+        <w:t>Choi H., Lee J., Yi Y., Na H., Kang K. and Kim T. (2022), 'Deep vision-based occupancy counting: experimental performance evaluation and implementation of ventilation control', Building and Environment, Vol. 223, Paper No.109496.</w:t>
       </w:r>
     </w:p>
     <w:p>
@@ -24029,7 +23908,7 @@
         </w:rPr>
         <w:t>4.</w:t>
         <w:tab/>
-        <w:t>Denkena B., Abele E., Brecher C., Dittrich M.-A., Kara S. and Mori M. (2020), 'Energy efficient machine tools', CIRP Annals - Manufacturing Technology, Vol. 69, No. 2, doi:10.1016/j.cirp.2020.05.008.</w:t>
+        <w:t>Denkena B., Abele E., Brecher C., Dittrich M.-A., Kara S. and Mori M. (2020), 'Energy efficient machine tools', CIRP Annals - Manufacturing Technology, Vol. 69, No.2, DOI 10.1016/j.cirp.2020.05.008.</w:t>
       </w:r>
     </w:p>
     <w:p>
@@ -24083,7 +23962,7 @@
         </w:rPr>
         <w:t>7.</w:t>
         <w:tab/>
-        <w:t>Gutowski T., Dahmus J. and Thiriez A. (2006), 'Electrical energy requirements for manufacturing processes', Proc. 13th CIRP International Conference on Life Cycle Engineering, Leuven, pp. 623-628.</w:t>
+        <w:t>Gutowski T., Dahmus J. and Thiriez A. (2006), 'Electrical energy requirements for manufacturing processes', Proc. 13th CIRP International Conference on Life Cycle Engineering, Leuven, pp.623-628.</w:t>
       </w:r>
     </w:p>
     <w:p>
@@ -24101,7 +23980,7 @@
         </w:rPr>
         <w:t>8.</w:t>
         <w:tab/>
-        <w:t>Gutowski T., Murphy C., Allen D., Bauer D., Bras B., Piwonka T., Sheng P., Sutherland J., Thurston D. and Wolff E. (2005), 'Environmentally benign manufacturing: observations from Japan, Europe and the United States', Journal of Cleaner Production, Vol. 13, No. 1, pp. 1-17.</w:t>
+        <w:t>Gutowski T., Murphy C., Allen D., Bauer D., Bras B., Piwonka T., Sheng P., Sutherland J., Thurston D. and Wolff E. (2005), 'Environmentally benign manufacturing: observations from Japan, Europe and the United States', Journal of Cleaner Production, Vol. 13, No.1, pp.1-17.</w:t>
       </w:r>
     </w:p>
     <w:p>
@@ -24209,7 +24088,7 @@
         </w:rPr>
         <w:t>14.</w:t>
         <w:tab/>
-        <w:t>Kara S. and Li W. (2011), 'Unit process energy consumption models for material removal processes', CIRP Annals - Manufacturing Technology, Vol. 60, No. 1, pp. 37-40.</w:t>
+        <w:t>Kara S. and Li W. (2011), 'Unit process energy consumption models for material removal processes', CIRP Annals - Manufacturing Technology, Vol. 60, No.1, pp.37-40.</w:t>
       </w:r>
     </w:p>
     <w:p>
@@ -24227,7 +24106,7 @@
         </w:rPr>
         <w:t>15.</w:t>
         <w:tab/>
-        <w:t>Kong M., Dong B., Zhang R. and O'Neill Z. (2022), 'HVAC energy savings, thermal comfort and air quality for occupant-centric control through a side-by-side experimental study', Applied Energy, Vol. 306, 117987.</w:t>
+        <w:t>Kong M., Dong B., Zhang R. and O'Neill Z. (2022), 'HVAC energy savings, thermal comfort and air quality for occupant-centric control through a side-by-side experimental study', Applied Energy, Vol. 306, Paper No.117987.</w:t>
       </w:r>
     </w:p>
     <w:p>
@@ -24245,7 +24124,7 @@
         </w:rPr>
         <w:t>16.</w:t>
         <w:tab/>
-        <w:t>Li W., Zein A., Kara S. and Herrmann C. (2011), 'An investigation into fixed energy consumption of machine tools', Proc. 18th CIRP International Conference on Life Cycle Engineering, Braunschweig, pp. 268-273.</w:t>
+        <w:t>Li W., Zein A., Kara S. and Herrmann C. (2011), 'An investigation into fixed energy consumption of machine tools', Proc. 18th CIRP International Conference on Life Cycle Engineering, Braunschweig, pp.268-273.</w:t>
       </w:r>
     </w:p>
     <w:p>
@@ -24263,7 +24142,7 @@
         </w:rPr>
         <w:t>17.</w:t>
         <w:tab/>
-        <w:t>Lin G., Casillas A., Sheng M. and Granderson J. (2023), 'Performance evaluation of an occupancy-based HVAC control system in an office building', Energies, Vol. 16, No. 20, 7088.</w:t>
+        <w:t>Lin G., Casillas A., Sheng M. and Granderson J. (2023), 'Performance evaluation of an occupancy-based HVAC control system in an office building', Energies, Vol. 16, No.20, Paper No.7088.</w:t>
       </w:r>
     </w:p>
     <w:p>
@@ -24281,7 +24160,7 @@
         </w:rPr>
         <w:t>18.</w:t>
         <w:tab/>
-        <w:t>Mori M., Fujishima M., Inamasu Y. and Oda Y. (2011), 'A study on energy efficiency improvement for machine tools', CIRP Annals - Manufacturing Technology, Vol. 60, No. 1, pp. 145-148.</w:t>
+        <w:t>Mori M., Fujishima M., Inamasu Y. and Oda Y. (2011), 'A study on energy efficiency improvement for machine tools', CIRP Annals - Manufacturing Technology, Vol. 60, No.1, pp.145-148.</w:t>
       </w:r>
     </w:p>
     <w:p>
@@ -24299,7 +24178,7 @@
         </w:rPr>
         <w:t>19.</w:t>
         <w:tab/>
-        <w:t>Mouzon G., Yildirim M.B. and Twomey J. (2007), 'Operational methods for minimization of energy consumption of manufacturing equipment', International Journal of Production Research, Vol. 45, No. 18-19, pp. 4247-4271.</w:t>
+        <w:t>Mouzon G., Yildirim M.B. and Twomey J. (2007), 'Operational methods for minimization of energy consumption of manufacturing equipment', International Journal of Production Research, Vol. 45, No.18-19, pp.4247-4271.</w:t>
       </w:r>
     </w:p>
     <w:p>
@@ -24371,7 +24250,7 @@
         </w:rPr>
         <w:t>23.</w:t>
         <w:tab/>
-        <w:t>Squeo M., Frigerio N. and Matta A. (2019), 'Multiple sleeping states for energy saving in CNC machining centers', Procedia CIRP, Vol. 80, pp. 144-149.</w:t>
+        <w:t>Squeo M., Frigerio N. and Matta A. (2019), 'Multiple sleeping states for energy saving in CNC machining centers', Procedia CIRP, Vol. 80, pp.144-149.</w:t>
       </w:r>
     </w:p>
     <w:p>
@@ -24407,7 +24286,7 @@
         </w:rPr>
         <w:t>25.</w:t>
         <w:tab/>
-        <w:t>Tamil Nadu Electricity Regulatory Commission (2025), 'Tariff Order No. 6 of 2025', TNERC, Chennai, 30 June 2025.</w:t>
+        <w:t>Tamil Nadu Electricity Regulatory Commission (2025), 'Tariff Order No.6 of 2025', TNERC, Chennai, 30 June 2025.</w:t>
       </w:r>
     </w:p>
     <w:p>
@@ -24425,7 +24304,7 @@
         </w:rPr>
         <w:t>26.</w:t>
         <w:tab/>
-        <w:t>Tien P.W., Wei S., Calautit J.K., Darkwa J. and Wood C. (2021), 'A computer vision-based occupancy and equipment usage detection approach for reducing building energy demand', Energies, Vol. 14, No. 1, 156.</w:t>
+        <w:t>Tien P.W., Wei S., Calautit J.K., Darkwa J. and Wood C. (2021), 'A computer vision-based occupancy and equipment usage detection approach for reducing building energy demand', Energies, Vol. 14, No.1, Paper No.156.</w:t>
       </w:r>
     </w:p>
     <w:p>
@@ -24461,7 +24340,7 @@
         </w:rPr>
         <w:t>28.</w:t>
         <w:tab/>
-        <w:t>Williams A., Atkinson B., Garbesi K., Page E. and Rubinstein F. (2012), 'Lighting controls in commercial buildings', LEUKOS, Vol. 8, No. 3, pp. 161-180.</w:t>
+        <w:t>Williams A., Atkinson B., Garbesi K., Page E. and Rubinstein F. (2012), 'Lighting controls in commercial buildings', LEUKOS, Vol. 8, No.3, pp.161-180.</w:t>
       </w:r>
     </w:p>
     <w:p>
@@ -24479,7 +24358,7 @@
         </w:rPr>
         <w:t>29.</w:t>
         <w:tab/>
-        <w:t>Zhang Y., Calautit J.K., Tien P.W., Wu Y. and Wei S. (2024), 'Deep learning models for vision-based occupancy detection in high occupancy buildings', Journal of Building Engineering, Vol. 98, 111355.</w:t>
+        <w:t>Zhang Y., Calautit J.K., Tien P.W., Wu Y. and Wei S. (2024), 'Deep learning models for vision-based occupancy detection in high occupancy buildings', Journal of Building Engineering, Vol. 98, Paper No.111355.</w:t>
       </w:r>
     </w:p>
     <w:sectPr>

</xml_diff>

<commit_message>
Acknowledgement: add signing space between student names, keep on one page
Co-Authored-By: Claude Opus 5.5 <noreply@anthropic.com>
Claude-Session: https://claude.ai/code/session_01DMwuYTdg3AZgNAfdc9qVym
</commit_message>
<xml_diff>
--- a/Final_Report.docx
+++ b/Final_Report.docx
@@ -775,7 +775,7 @@
     <w:p>
       <w:pPr>
         <w:pStyle w:val="Body"/>
-        <w:spacing w:line="480" w:lineRule="auto"/>
+        <w:spacing w:after="0" w:line="480" w:lineRule="auto"/>
       </w:pPr>
       <w:r>
         <w:rPr>
@@ -788,33 +788,33 @@
     <w:p>
       <w:pPr>
         <w:pStyle w:val="Body"/>
-        <w:spacing w:line="480" w:lineRule="auto"/>
+        <w:spacing w:after="0" w:line="480" w:lineRule="auto"/>
       </w:pPr>
       <w:r>
         <w:rPr>
           <w:b w:val="0"/>
           <w:i w:val="0"/>
         </w:rPr>
-        <w:t>We are thankful to Dr. S. Radha, Principal, Sri Sivasubramaniya Nadar College of Engineering, for the support and encouragement extended to us throughout our course of study.</w:t>
+        <w:t>We are thankful to Dr. S. Radha, Principal, for the support and encouragement extended to us.</w:t>
       </w:r>
     </w:p>
     <w:p>
       <w:pPr>
         <w:pStyle w:val="Body"/>
-        <w:spacing w:line="480" w:lineRule="auto"/>
+        <w:spacing w:after="0" w:line="480" w:lineRule="auto"/>
       </w:pPr>
       <w:r>
         <w:rPr>
           <w:b w:val="0"/>
           <w:i w:val="0"/>
         </w:rPr>
-        <w:t>We thank Dr. V. Rajini, Professor and Head, Department of Electrical and Electronics Engineering, for her encouragement and support throughout this work.</w:t>
+        <w:t>We thank Dr. V. Rajini, Professor and Head, Department of Electrical and Electronics Engineering, for her encouragement and support.</w:t>
       </w:r>
     </w:p>
     <w:p>
       <w:pPr>
         <w:pStyle w:val="Body"/>
-        <w:spacing w:line="480" w:lineRule="auto"/>
+        <w:spacing w:after="0" w:line="480" w:lineRule="auto"/>
       </w:pPr>
       <w:r>
         <w:rPr>
@@ -827,7 +827,7 @@
     <w:p>
       <w:pPr>
         <w:pStyle w:val="Body"/>
-        <w:spacing w:line="480" w:lineRule="auto"/>
+        <w:spacing w:after="0" w:line="480" w:lineRule="auto"/>
       </w:pPr>
       <w:r>
         <w:rPr>
@@ -839,7 +839,7 @@
     </w:p>
     <w:p>
       <w:pPr>
-        <w:spacing w:after="0" w:line="240" w:lineRule="auto" w:before="240"/>
+        <w:spacing w:after="0" w:line="240" w:lineRule="auto" w:before="720"/>
         <w:jc w:val="right"/>
       </w:pPr>
       <w:r>
@@ -852,7 +852,7 @@
     </w:p>
     <w:p>
       <w:pPr>
-        <w:spacing w:after="0" w:line="240" w:lineRule="auto" w:before="240"/>
+        <w:spacing w:after="0" w:line="240" w:lineRule="auto" w:before="720"/>
         <w:jc w:val="right"/>
       </w:pPr>
       <w:r>
@@ -865,7 +865,7 @@
     </w:p>
     <w:p>
       <w:pPr>
-        <w:spacing w:after="0" w:line="240" w:lineRule="auto" w:before="240"/>
+        <w:spacing w:after="0" w:line="240" w:lineRule="auto" w:before="720"/>
         <w:jc w:val="right"/>
       </w:pPr>
       <w:r>

</xml_diff>